<commit_message>
Baseline before new changes
</commit_message>
<xml_diff>
--- a/documents/BankingChatBotAgentAIProposal.docx
+++ b/documents/BankingChatBotAgentAIProposal.docx
@@ -87,29 +87,13 @@
         </w:numPr>
       </w:pPr>
       <w:r>
-        <w:t xml:space="preserve">If user asks too general questions like technical issues, need to ask a question, need to see an </w:t>
-      </w:r>
-      <w:proofErr w:type="gramStart"/>
-      <w:r>
-        <w:t>agent,…</w:t>
-      </w:r>
-      <w:proofErr w:type="gramEnd"/>
-      <w:r>
-        <w:t xml:space="preserve"> then the AI will </w:t>
+        <w:t xml:space="preserve">If user asks too general questions like technical issues, need to ask a question, need to see an agent,… then the AI will </w:t>
       </w:r>
       <w:r>
         <w:t xml:space="preserve">try to </w:t>
       </w:r>
       <w:r>
-        <w:t xml:space="preserve">clarify their issue. If it can’t get the detail issue, it will provide the phone number of live </w:t>
-      </w:r>
-      <w:proofErr w:type="gramStart"/>
-      <w:r>
-        <w:t>agent</w:t>
-      </w:r>
-      <w:proofErr w:type="gramEnd"/>
-      <w:r>
-        <w:t xml:space="preserve"> </w:t>
+        <w:t xml:space="preserve">clarify their issue. If it can’t get the detail issue, it will provide the phone number of live agent </w:t>
       </w:r>
       <w:r>
         <w:t xml:space="preserve">corresponding to “Other” category </w:t>
@@ -118,23 +102,7 @@
         <w:t>to solve.</w:t>
       </w:r>
       <w:r>
-        <w:t xml:space="preserve"> If it can get the detail issue but it can’t support that </w:t>
-      </w:r>
-      <w:proofErr w:type="gramStart"/>
-      <w:r>
-        <w:t>issue</w:t>
-      </w:r>
-      <w:proofErr w:type="gramEnd"/>
-      <w:r>
-        <w:t xml:space="preserve"> then it will provide the phone number of live </w:t>
-      </w:r>
-      <w:proofErr w:type="gramStart"/>
-      <w:r>
-        <w:t>agent</w:t>
-      </w:r>
-      <w:proofErr w:type="gramEnd"/>
-      <w:r>
-        <w:t xml:space="preserve"> corresponding to issue’s category to solve</w:t>
+        <w:t xml:space="preserve"> If it can get the detail issue but it can’t support that issue then it will provide the phone number of live agent corresponding to issue’s category to solve</w:t>
       </w:r>
     </w:p>
     <w:tbl>
@@ -218,7 +186,6 @@
                 <w14:ligatures w14:val="none"/>
               </w:rPr>
             </w:pPr>
-            <w:proofErr w:type="spellStart"/>
             <w:r>
               <w:rPr>
                 <w:rFonts w:ascii="Aptos Narrow" w:eastAsia="Times New Roman" w:hAnsi="Aptos Narrow" w:cs="Times New Roman"/>
@@ -232,7 +199,6 @@
               </w:rPr>
               <w:t>PhoneNum</w:t>
             </w:r>
-            <w:proofErr w:type="spellEnd"/>
           </w:p>
         </w:tc>
       </w:tr>
@@ -259,7 +225,6 @@
                 <w14:ligatures w14:val="none"/>
               </w:rPr>
             </w:pPr>
-            <w:proofErr w:type="spellStart"/>
             <w:r>
               <w:rPr>
                 <w:rFonts w:ascii="Aptos Narrow" w:eastAsia="Times New Roman" w:hAnsi="Aptos Narrow" w:cs="Times New Roman"/>
@@ -271,7 +236,6 @@
               </w:rPr>
               <w:t>bank_account</w:t>
             </w:r>
-            <w:proofErr w:type="spellEnd"/>
           </w:p>
         </w:tc>
         <w:tc>
@@ -399,7 +363,6 @@
                 <w14:ligatures w14:val="none"/>
               </w:rPr>
             </w:pPr>
-            <w:proofErr w:type="spellStart"/>
             <w:r>
               <w:rPr>
                 <w:rFonts w:ascii="Aptos Narrow" w:eastAsia="Times New Roman" w:hAnsi="Aptos Narrow" w:cs="Times New Roman"/>
@@ -411,7 +374,6 @@
               </w:rPr>
               <w:t>general_issues</w:t>
             </w:r>
-            <w:proofErr w:type="spellEnd"/>
           </w:p>
         </w:tc>
         <w:tc>
@@ -470,7 +432,6 @@
                 <w14:ligatures w14:val="none"/>
               </w:rPr>
             </w:pPr>
-            <w:proofErr w:type="spellStart"/>
             <w:r>
               <w:rPr>
                 <w:rFonts w:ascii="Aptos Narrow" w:eastAsia="Times New Roman" w:hAnsi="Aptos Narrow" w:cs="Times New Roman"/>
@@ -482,7 +443,6 @@
               </w:rPr>
               <w:t>technical_support</w:t>
             </w:r>
-            <w:proofErr w:type="spellEnd"/>
           </w:p>
         </w:tc>
         <w:tc>
@@ -552,15 +512,7 @@
         <w:t>issues</w:t>
       </w:r>
       <w:r>
-        <w:t xml:space="preserve"> such as </w:t>
-      </w:r>
-      <w:proofErr w:type="gramStart"/>
-      <w:r>
-        <w:t>forgot</w:t>
-      </w:r>
-      <w:proofErr w:type="gramEnd"/>
-      <w:r>
-        <w:t xml:space="preserve"> login detail, lost or stolen card, OTP issues..</w:t>
+        <w:t xml:space="preserve"> such as forgot login detail, lost or stolen card, OTP issues..</w:t>
       </w:r>
       <w:r>
         <w:t>.</w:t>
@@ -750,11 +702,9 @@
         </w:numPr>
         <w:ind w:left="1890"/>
       </w:pPr>
-      <w:proofErr w:type="spellStart"/>
       <w:r>
         <w:t>InforMsg</w:t>
       </w:r>
-      <w:proofErr w:type="spellEnd"/>
     </w:p>
     <w:p>
       <w:pPr>
@@ -1132,16 +1082,11 @@
         </w:numPr>
         <w:ind w:left="2250"/>
       </w:pPr>
-      <w:proofErr w:type="gramStart"/>
       <w:r>
         <w:t xml:space="preserve">Date </w:t>
       </w:r>
       <w:r>
-        <w:t>time</w:t>
-      </w:r>
-      <w:proofErr w:type="gramEnd"/>
-      <w:r>
-        <w:t xml:space="preserve"> </w:t>
+        <w:t xml:space="preserve">time </w:t>
       </w:r>
       <w:r>
         <w:t>of transaction</w:t>
@@ -1183,15 +1128,7 @@
         <w:ind w:left="2250"/>
       </w:pPr>
       <w:r>
-        <w:t xml:space="preserve">Status of transaction (SENT, </w:t>
-      </w:r>
-      <w:proofErr w:type="gramStart"/>
-      <w:r>
-        <w:t>DISPUTED,PENDING</w:t>
-      </w:r>
-      <w:proofErr w:type="gramEnd"/>
-      <w:r>
-        <w:t>)</w:t>
+        <w:t>Status of transaction (SENT, DISPUTED,PENDING)</w:t>
       </w:r>
     </w:p>
     <w:p>
@@ -1319,13 +1256,8 @@
         </w:numPr>
         <w:ind w:left="1890"/>
       </w:pPr>
-      <w:proofErr w:type="gramStart"/>
-      <w:r>
-        <w:t>Date time</w:t>
-      </w:r>
-      <w:proofErr w:type="gramEnd"/>
-      <w:r>
-        <w:t xml:space="preserve"> of transaction</w:t>
+      <w:r>
+        <w:t>Date time of transaction</w:t>
       </w:r>
     </w:p>
     <w:p>
@@ -1376,11 +1308,9 @@
         </w:numPr>
         <w:ind w:left="1890"/>
       </w:pPr>
-      <w:proofErr w:type="spellStart"/>
       <w:r>
         <w:t>InforMsg</w:t>
       </w:r>
-      <w:proofErr w:type="spellEnd"/>
     </w:p>
     <w:p>
       <w:pPr>
@@ -1893,6 +1823,95 @@
         <w:pStyle w:val="ListParagraph"/>
         <w:numPr>
           <w:ilvl w:val="0"/>
+          <w:numId w:val="6"/>
+        </w:numPr>
+        <w:ind w:left="1170"/>
+        <w:rPr>
+          <w:b/>
+          <w:bCs/>
+        </w:rPr>
+      </w:pPr>
+      <w:r>
+        <w:rPr>
+          <w:b/>
+          <w:bCs/>
+        </w:rPr>
+        <w:t xml:space="preserve">Refuse to answer </w:t>
+      </w:r>
+      <w:r>
+        <w:rPr>
+          <w:b/>
+          <w:bCs/>
+        </w:rPr>
+        <w:t>if user asks questions outside of banking’s business logic</w:t>
+      </w:r>
+    </w:p>
+    <w:p>
+      <w:pPr>
+        <w:pStyle w:val="ListParagraph"/>
+        <w:ind w:left="450"/>
+        <w:rPr>
+          <w:b/>
+          <w:bCs/>
+        </w:rPr>
+      </w:pPr>
+      <w:r>
+        <w:rPr>
+          <w:noProof/>
+        </w:rPr>
+        <w:lastRenderedPageBreak/>
+        <w:drawing>
+          <wp:inline distT="0" distB="0" distL="0" distR="0" wp14:anchorId="2FBCD578" wp14:editId="174AD3F3">
+            <wp:extent cx="5943600" cy="4376420"/>
+            <wp:effectExtent l="0" t="0" r="0" b="5080"/>
+            <wp:docPr id="795340447" name="Picture 1" descr="A screenshot of a chat&#10;&#10;AI-generated content may be incorrect."/>
+            <wp:cNvGraphicFramePr>
+              <a:graphicFrameLocks xmlns:a="http://schemas.openxmlformats.org/drawingml/2006/main" noChangeAspect="1"/>
+            </wp:cNvGraphicFramePr>
+            <a:graphic xmlns:a="http://schemas.openxmlformats.org/drawingml/2006/main">
+              <a:graphicData uri="http://schemas.openxmlformats.org/drawingml/2006/picture">
+                <pic:pic xmlns:pic="http://schemas.openxmlformats.org/drawingml/2006/picture">
+                  <pic:nvPicPr>
+                    <pic:cNvPr id="795340447" name="Picture 1" descr="A screenshot of a chat&#10;&#10;AI-generated content may be incorrect."/>
+                    <pic:cNvPicPr/>
+                  </pic:nvPicPr>
+                  <pic:blipFill>
+                    <a:blip r:embed="rId16"/>
+                    <a:stretch>
+                      <a:fillRect/>
+                    </a:stretch>
+                  </pic:blipFill>
+                  <pic:spPr>
+                    <a:xfrm>
+                      <a:off x="0" y="0"/>
+                      <a:ext cx="5943600" cy="4376420"/>
+                    </a:xfrm>
+                    <a:prstGeom prst="rect">
+                      <a:avLst/>
+                    </a:prstGeom>
+                  </pic:spPr>
+                </pic:pic>
+              </a:graphicData>
+            </a:graphic>
+          </wp:inline>
+        </w:drawing>
+      </w:r>
+    </w:p>
+    <w:p>
+      <w:pPr>
+        <w:pStyle w:val="ListParagraph"/>
+        <w:ind w:left="1170"/>
+        <w:rPr>
+          <w:b/>
+          <w:bCs/>
+        </w:rPr>
+      </w:pPr>
+    </w:p>
+    <w:p>
+      <w:pPr>
+        <w:pStyle w:val="ListParagraph"/>
+        <w:numPr>
+          <w:ilvl w:val="0"/>
           <w:numId w:val="1"/>
         </w:numPr>
         <w:ind w:left="450" w:hanging="450"/>
@@ -2107,6 +2126,7 @@
         <w:ind w:left="810"/>
       </w:pPr>
       <w:r>
+        <w:lastRenderedPageBreak/>
         <w:t>All these agents will work together to answer user’s questions.</w:t>
       </w:r>
     </w:p>
@@ -2120,7 +2140,6 @@
         <w:ind w:left="810"/>
       </w:pPr>
       <w:r>
-        <w:lastRenderedPageBreak/>
         <w:t xml:space="preserve">For requests that need to update or insert data into DB, AI agent will confirm with user before </w:t>
       </w:r>
       <w:r>
@@ -2167,7 +2186,7 @@
                     <pic:cNvPicPr/>
                   </pic:nvPicPr>
                   <pic:blipFill>
-                    <a:blip r:embed="rId16"/>
+                    <a:blip r:embed="rId17"/>
                     <a:stretch>
                       <a:fillRect/>
                     </a:stretch>
@@ -2223,13 +2242,8 @@
         <w:ind w:left="810"/>
       </w:pPr>
       <w:r>
-        <w:t xml:space="preserve">Using </w:t>
-      </w:r>
-      <w:proofErr w:type="spellStart"/>
-      <w:r>
-        <w:t>LangSmith</w:t>
-      </w:r>
-      <w:proofErr w:type="spellEnd"/>
+        <w:t>Using LangSmith</w:t>
+      </w:r>
     </w:p>
     <w:p>
       <w:pPr>
@@ -2251,17 +2265,9 @@
         <w:t xml:space="preserve"> will be recorded </w:t>
       </w:r>
       <w:r>
-        <w:t xml:space="preserve">on </w:t>
-      </w:r>
-      <w:proofErr w:type="spellStart"/>
-      <w:r>
-        <w:t>LangSmith</w:t>
-      </w:r>
-      <w:proofErr w:type="spellEnd"/>
-      <w:r>
-        <w:t xml:space="preserve"> website </w:t>
-      </w:r>
-      <w:hyperlink r:id="rId17" w:history="1">
+        <w:t xml:space="preserve">on LangSmith website </w:t>
+      </w:r>
+      <w:hyperlink r:id="rId18" w:history="1">
         <w:r>
           <w:rPr>
             <w:rStyle w:val="Hyperlink"/>
@@ -2273,15 +2279,7 @@
         <w:t xml:space="preserve"> </w:t>
       </w:r>
       <w:r>
-        <w:t xml:space="preserve"> with detail information like </w:t>
-      </w:r>
-      <w:proofErr w:type="spellStart"/>
-      <w:r>
-        <w:t>sessionid</w:t>
-      </w:r>
-      <w:proofErr w:type="spellEnd"/>
-      <w:r>
-        <w:t>, date time, the flow of conversation, which tool has been called with which input parameters</w:t>
+        <w:t xml:space="preserve"> with detail information like sessionid, date time, the flow of conversation, which tool has been called with which input parameters</w:t>
       </w:r>
       <w:r>
         <w:t>, the trace to LLM calls,..</w:t>
@@ -2312,7 +2310,7 @@
                     <pic:cNvPicPr/>
                   </pic:nvPicPr>
                   <pic:blipFill>
-                    <a:blip r:embed="rId18"/>
+                    <a:blip r:embed="rId19"/>
                     <a:stretch>
                       <a:fillRect/>
                     </a:stretch>
@@ -2343,6 +2341,7 @@
         <w:ind w:left="810"/>
       </w:pPr>
       <w:r>
+        <w:lastRenderedPageBreak/>
         <w:t>Using package logging:</w:t>
       </w:r>
     </w:p>
@@ -2357,7 +2356,6 @@
         <w:ind w:left="1170"/>
       </w:pPr>
       <w:r>
-        <w:lastRenderedPageBreak/>
         <w:t>The API key</w:t>
       </w:r>
       <w:r>
@@ -2384,6 +2382,9 @@
         <w:ind w:left="1170"/>
       </w:pPr>
       <w:r>
+        <w:rPr>
+          <w:noProof/>
+        </w:rPr>
         <mc:AlternateContent>
           <mc:Choice Requires="wps">
             <w:drawing>
@@ -2437,48 +2438,7 @@
                                 <w:sz w:val="22"/>
                                 <w:szCs w:val="22"/>
                               </w:rPr>
-                              <w:t>10:09:34 INFO [</w:t>
-                            </w:r>
-                            <w:proofErr w:type="spellStart"/>
-                            <w:proofErr w:type="gramStart"/>
-                            <w:r>
-                              <w:rPr>
-                                <w:sz w:val="22"/>
-                                <w:szCs w:val="22"/>
-                              </w:rPr>
-                              <w:t>bankbot.tools</w:t>
-                            </w:r>
-                            <w:proofErr w:type="gramEnd"/>
-                            <w:r>
-                              <w:rPr>
-                                <w:sz w:val="22"/>
-                                <w:szCs w:val="22"/>
-                              </w:rPr>
-                              <w:t>.transaction_tool</w:t>
-                            </w:r>
-                            <w:proofErr w:type="spellEnd"/>
-                            <w:r>
-                              <w:rPr>
-                                <w:sz w:val="22"/>
-                                <w:szCs w:val="22"/>
-                              </w:rPr>
-                              <w:t xml:space="preserve">] </w:t>
-                            </w:r>
-                            <w:proofErr w:type="spellStart"/>
-                            <w:r>
-                              <w:rPr>
-                                <w:sz w:val="22"/>
-                                <w:szCs w:val="22"/>
-                              </w:rPr>
-                              <w:t>account_number</w:t>
-                            </w:r>
-                            <w:proofErr w:type="spellEnd"/>
-                            <w:r>
-                              <w:rPr>
-                                <w:sz w:val="22"/>
-                                <w:szCs w:val="22"/>
-                              </w:rPr>
-                              <w:t>=3423346</w:t>
+                              <w:t>10:09:34 INFO [bankbot.tools.transaction_tool] account_number=3423346</w:t>
                             </w:r>
                           </w:p>
                           <w:p>
@@ -2495,32 +2455,7 @@
                                 <w:sz w:val="22"/>
                                 <w:szCs w:val="22"/>
                               </w:rPr>
-                              <w:t>10:09:34 DEBUG [</w:t>
-                            </w:r>
-                            <w:proofErr w:type="spellStart"/>
-                            <w:proofErr w:type="gramStart"/>
-                            <w:r>
-                              <w:rPr>
-                                <w:sz w:val="22"/>
-                                <w:szCs w:val="22"/>
-                              </w:rPr>
-                              <w:t>bankbot.tools</w:t>
-                            </w:r>
-                            <w:proofErr w:type="gramEnd"/>
-                            <w:r>
-                              <w:rPr>
-                                <w:sz w:val="22"/>
-                                <w:szCs w:val="22"/>
-                              </w:rPr>
-                              <w:t>.transaction_tool</w:t>
-                            </w:r>
-                            <w:proofErr w:type="spellEnd"/>
-                            <w:r>
-                              <w:rPr>
-                                <w:sz w:val="22"/>
-                                <w:szCs w:val="22"/>
-                              </w:rPr>
-                              <w:t xml:space="preserve">] Executing search SQL: </w:t>
+                              <w:t xml:space="preserve">10:09:34 DEBUG [bankbot.tools.transaction_tool] Executing search SQL: </w:t>
                             </w:r>
                           </w:p>
                           <w:p>
@@ -2537,87 +2472,7 @@
                                 <w:sz w:val="22"/>
                                 <w:szCs w:val="22"/>
                               </w:rPr>
-                              <w:t xml:space="preserve">                    Select </w:t>
-                            </w:r>
-                            <w:proofErr w:type="spellStart"/>
-                            <w:r>
-                              <w:rPr>
-                                <w:sz w:val="22"/>
-                                <w:szCs w:val="22"/>
-                              </w:rPr>
-                              <w:t>TransactionId</w:t>
-                            </w:r>
-                            <w:proofErr w:type="spellEnd"/>
-                            <w:r>
-                              <w:rPr>
-                                <w:sz w:val="22"/>
-                                <w:szCs w:val="22"/>
-                              </w:rPr>
-                              <w:t xml:space="preserve"> from </w:t>
-                            </w:r>
-                            <w:proofErr w:type="spellStart"/>
-                            <w:r>
-                              <w:rPr>
-                                <w:sz w:val="22"/>
-                                <w:szCs w:val="22"/>
-                              </w:rPr>
-                              <w:t>banktransaction</w:t>
-                            </w:r>
-                            <w:proofErr w:type="spellEnd"/>
-                            <w:r>
-                              <w:rPr>
-                                <w:sz w:val="22"/>
-                                <w:szCs w:val="22"/>
-                              </w:rPr>
-                              <w:t xml:space="preserve"> where </w:t>
-                            </w:r>
-                            <w:proofErr w:type="spellStart"/>
-                            <w:r>
-                              <w:rPr>
-                                <w:sz w:val="22"/>
-                                <w:szCs w:val="22"/>
-                              </w:rPr>
-                              <w:t>AccountNumber</w:t>
-                            </w:r>
-                            <w:proofErr w:type="spellEnd"/>
-                            <w:r>
-                              <w:rPr>
-                                <w:sz w:val="22"/>
-                                <w:szCs w:val="22"/>
-                              </w:rPr>
-                              <w:t xml:space="preserve"> = %s and </w:t>
-                            </w:r>
-                            <w:proofErr w:type="spellStart"/>
-                            <w:r>
-                              <w:rPr>
-                                <w:sz w:val="22"/>
-                                <w:szCs w:val="22"/>
-                              </w:rPr>
-                              <w:t>TransDateTime</w:t>
-                            </w:r>
-                            <w:proofErr w:type="spellEnd"/>
-                            <w:r>
-                              <w:rPr>
-                                <w:sz w:val="22"/>
-                                <w:szCs w:val="22"/>
-                              </w:rPr>
-                              <w:t xml:space="preserve"> = %s and </w:t>
-                            </w:r>
-                            <w:proofErr w:type="spellStart"/>
-                            <w:r>
-                              <w:rPr>
-                                <w:sz w:val="22"/>
-                                <w:szCs w:val="22"/>
-                              </w:rPr>
-                              <w:t>ReceiverFirstName</w:t>
-                            </w:r>
-                            <w:proofErr w:type="spellEnd"/>
-                            <w:r>
-                              <w:rPr>
-                                <w:sz w:val="22"/>
-                                <w:szCs w:val="22"/>
-                              </w:rPr>
-                              <w:t xml:space="preserve"> = %s and</w:t>
+                              <w:t xml:space="preserve">                    Select TransactionId from banktransaction where AccountNumber = %s and TransDateTime = %s and ReceiverFirstName = %s and</w:t>
                             </w:r>
                           </w:p>
                           <w:p>
@@ -2634,39 +2489,7 @@
                                 <w:sz w:val="22"/>
                                 <w:szCs w:val="22"/>
                               </w:rPr>
-                              <w:t xml:space="preserve">                    </w:t>
-                            </w:r>
-                            <w:proofErr w:type="spellStart"/>
-                            <w:r>
-                              <w:rPr>
-                                <w:sz w:val="22"/>
-                                <w:szCs w:val="22"/>
-                              </w:rPr>
-                              <w:t>ReceiverLastName</w:t>
-                            </w:r>
-                            <w:proofErr w:type="spellEnd"/>
-                            <w:r>
-                              <w:rPr>
-                                <w:sz w:val="22"/>
-                                <w:szCs w:val="22"/>
-                              </w:rPr>
-                              <w:t xml:space="preserve"> = %s and </w:t>
-                            </w:r>
-                            <w:proofErr w:type="spellStart"/>
-                            <w:r>
-                              <w:rPr>
-                                <w:sz w:val="22"/>
-                                <w:szCs w:val="22"/>
-                              </w:rPr>
-                              <w:t>TransferAmount</w:t>
-                            </w:r>
-                            <w:proofErr w:type="spellEnd"/>
-                            <w:r>
-                              <w:rPr>
-                                <w:sz w:val="22"/>
-                                <w:szCs w:val="22"/>
-                              </w:rPr>
-                              <w:t xml:space="preserve"> = %s</w:t>
+                              <w:t xml:space="preserve">                    ReceiverLastName = %s and TransferAmount = %s</w:t>
                             </w:r>
                           </w:p>
                           <w:p>
@@ -2683,41 +2506,7 @@
                                 <w:sz w:val="22"/>
                                 <w:szCs w:val="22"/>
                               </w:rPr>
-                              <w:t xml:space="preserve">                 | params</w:t>
-                            </w:r>
-                            <w:proofErr w:type="gramStart"/>
-                            <w:r>
-                              <w:rPr>
-                                <w:sz w:val="22"/>
-                                <w:szCs w:val="22"/>
-                              </w:rPr>
-                              <w:t>=(</w:t>
-                            </w:r>
-                            <w:proofErr w:type="gramEnd"/>
-                            <w:r>
-                              <w:rPr>
-                                <w:sz w:val="22"/>
-                                <w:szCs w:val="22"/>
-                              </w:rPr>
-                              <w:t xml:space="preserve">'3423346', </w:t>
-                            </w:r>
-                            <w:proofErr w:type="spellStart"/>
-                            <w:proofErr w:type="gramStart"/>
-                            <w:r>
-                              <w:rPr>
-                                <w:sz w:val="22"/>
-                                <w:szCs w:val="22"/>
-                              </w:rPr>
-                              <w:t>datetime.datetime</w:t>
-                            </w:r>
-                            <w:proofErr w:type="spellEnd"/>
-                            <w:proofErr w:type="gramEnd"/>
-                            <w:r>
-                              <w:rPr>
-                                <w:sz w:val="22"/>
-                                <w:szCs w:val="22"/>
-                              </w:rPr>
-                              <w:t>(2025, 5, 4, 13, 0, 30), 'Watson', 'Castillo', 345)</w:t>
+                              <w:t xml:space="preserve">                 | params=('3423346', datetime.datetime(2025, 5, 4, 13, 0, 30), 'Watson', 'Castillo', 345)</w:t>
                             </w:r>
                           </w:p>
                           <w:p>
@@ -2734,32 +2523,7 @@
                                 <w:sz w:val="22"/>
                                 <w:szCs w:val="22"/>
                               </w:rPr>
-                              <w:t>10:09:34 DEBUG [</w:t>
-                            </w:r>
-                            <w:proofErr w:type="spellStart"/>
-                            <w:proofErr w:type="gramStart"/>
-                            <w:r>
-                              <w:rPr>
-                                <w:sz w:val="22"/>
-                                <w:szCs w:val="22"/>
-                              </w:rPr>
-                              <w:t>bankbot.tools</w:t>
-                            </w:r>
-                            <w:proofErr w:type="gramEnd"/>
-                            <w:r>
-                              <w:rPr>
-                                <w:sz w:val="22"/>
-                                <w:szCs w:val="22"/>
-                              </w:rPr>
-                              <w:t>.transaction_tool</w:t>
-                            </w:r>
-                            <w:proofErr w:type="spellEnd"/>
-                            <w:r>
-                              <w:rPr>
-                                <w:sz w:val="22"/>
-                                <w:szCs w:val="22"/>
-                              </w:rPr>
-                              <w:t xml:space="preserve">] Executing update SQL: </w:t>
+                              <w:t xml:space="preserve">10:09:34 DEBUG [bankbot.tools.transaction_tool] Executing update SQL: </w:t>
                             </w:r>
                           </w:p>
                           <w:p>
@@ -2776,55 +2540,7 @@
                                 <w:sz w:val="22"/>
                                 <w:szCs w:val="22"/>
                               </w:rPr>
-                              <w:t xml:space="preserve">                    Update </w:t>
-                            </w:r>
-                            <w:proofErr w:type="spellStart"/>
-                            <w:r>
-                              <w:rPr>
-                                <w:sz w:val="22"/>
-                                <w:szCs w:val="22"/>
-                              </w:rPr>
-                              <w:t>banktransaction</w:t>
-                            </w:r>
-                            <w:proofErr w:type="spellEnd"/>
-                            <w:r>
-                              <w:rPr>
-                                <w:sz w:val="22"/>
-                                <w:szCs w:val="22"/>
-                              </w:rPr>
-                              <w:t xml:space="preserve"> set </w:t>
-                            </w:r>
-                            <w:proofErr w:type="spellStart"/>
-                            <w:r>
-                              <w:rPr>
-                                <w:sz w:val="22"/>
-                                <w:szCs w:val="22"/>
-                              </w:rPr>
-                              <w:t>TransferStatus</w:t>
-                            </w:r>
-                            <w:proofErr w:type="spellEnd"/>
-                            <w:r>
-                              <w:rPr>
-                                <w:sz w:val="22"/>
-                                <w:szCs w:val="22"/>
-                              </w:rPr>
-                              <w:t xml:space="preserve"> = %s where </w:t>
-                            </w:r>
-                            <w:proofErr w:type="spellStart"/>
-                            <w:r>
-                              <w:rPr>
-                                <w:sz w:val="22"/>
-                                <w:szCs w:val="22"/>
-                              </w:rPr>
-                              <w:t>TransactionId</w:t>
-                            </w:r>
-                            <w:proofErr w:type="spellEnd"/>
-                            <w:r>
-                              <w:rPr>
-                                <w:sz w:val="22"/>
-                                <w:szCs w:val="22"/>
-                              </w:rPr>
-                              <w:t xml:space="preserve"> = %s</w:t>
+                              <w:t xml:space="preserve">                    Update banktransaction set TransferStatus = %s where TransactionId = %s</w:t>
                             </w:r>
                           </w:p>
                           <w:p>
@@ -2841,23 +2557,7 @@
                                 <w:sz w:val="22"/>
                                 <w:szCs w:val="22"/>
                               </w:rPr>
-                              <w:t xml:space="preserve">                 | params</w:t>
-                            </w:r>
-                            <w:proofErr w:type="gramStart"/>
-                            <w:r>
-                              <w:rPr>
-                                <w:sz w:val="22"/>
-                                <w:szCs w:val="22"/>
-                              </w:rPr>
-                              <w:t>=(</w:t>
-                            </w:r>
-                            <w:proofErr w:type="gramEnd"/>
-                            <w:r>
-                              <w:rPr>
-                                <w:sz w:val="22"/>
-                                <w:szCs w:val="22"/>
-                              </w:rPr>
-                              <w:t>'Disputed', '2368')</w:t>
+                              <w:t xml:space="preserve">                 | params=('Disputed', '2368')</w:t>
                             </w:r>
                           </w:p>
                           <w:p>
@@ -2874,48 +2574,7 @@
                                 <w:sz w:val="22"/>
                                 <w:szCs w:val="22"/>
                               </w:rPr>
-                              <w:t>10:09:34 DEBUG [</w:t>
-                            </w:r>
-                            <w:proofErr w:type="spellStart"/>
-                            <w:proofErr w:type="gramStart"/>
-                            <w:r>
-                              <w:rPr>
-                                <w:sz w:val="22"/>
-                                <w:szCs w:val="22"/>
-                              </w:rPr>
-                              <w:t>bankbot.tools</w:t>
-                            </w:r>
-                            <w:proofErr w:type="gramEnd"/>
-                            <w:r>
-                              <w:rPr>
-                                <w:sz w:val="22"/>
-                                <w:szCs w:val="22"/>
-                              </w:rPr>
-                              <w:t>.transaction_tool</w:t>
-                            </w:r>
-                            <w:proofErr w:type="spellEnd"/>
-                            <w:r>
-                              <w:rPr>
-                                <w:sz w:val="22"/>
-                                <w:szCs w:val="22"/>
-                              </w:rPr>
-                              <w:t xml:space="preserve">] Executed. </w:t>
-                            </w:r>
-                            <w:proofErr w:type="spellStart"/>
-                            <w:r>
-                              <w:rPr>
-                                <w:sz w:val="22"/>
-                                <w:szCs w:val="22"/>
-                              </w:rPr>
-                              <w:t>rowcount</w:t>
-                            </w:r>
-                            <w:proofErr w:type="spellEnd"/>
-                            <w:r>
-                              <w:rPr>
-                                <w:sz w:val="22"/>
-                                <w:szCs w:val="22"/>
-                              </w:rPr>
-                              <w:t>=1</w:t>
+                              <w:t>10:09:34 DEBUG [bankbot.tools.transaction_tool] Executed. rowcount=1</w:t>
                             </w:r>
                           </w:p>
                         </w:txbxContent>
@@ -2961,48 +2620,7 @@
                           <w:sz w:val="22"/>
                           <w:szCs w:val="22"/>
                         </w:rPr>
-                        <w:t>10:09:34 INFO [</w:t>
-                      </w:r>
-                      <w:proofErr w:type="spellStart"/>
-                      <w:proofErr w:type="gramStart"/>
-                      <w:r>
-                        <w:rPr>
-                          <w:sz w:val="22"/>
-                          <w:szCs w:val="22"/>
-                        </w:rPr>
-                        <w:t>bankbot.tools</w:t>
-                      </w:r>
-                      <w:proofErr w:type="gramEnd"/>
-                      <w:r>
-                        <w:rPr>
-                          <w:sz w:val="22"/>
-                          <w:szCs w:val="22"/>
-                        </w:rPr>
-                        <w:t>.transaction_tool</w:t>
-                      </w:r>
-                      <w:proofErr w:type="spellEnd"/>
-                      <w:r>
-                        <w:rPr>
-                          <w:sz w:val="22"/>
-                          <w:szCs w:val="22"/>
-                        </w:rPr>
-                        <w:t xml:space="preserve">] </w:t>
-                      </w:r>
-                      <w:proofErr w:type="spellStart"/>
-                      <w:r>
-                        <w:rPr>
-                          <w:sz w:val="22"/>
-                          <w:szCs w:val="22"/>
-                        </w:rPr>
-                        <w:t>account_number</w:t>
-                      </w:r>
-                      <w:proofErr w:type="spellEnd"/>
-                      <w:r>
-                        <w:rPr>
-                          <w:sz w:val="22"/>
-                          <w:szCs w:val="22"/>
-                        </w:rPr>
-                        <w:t>=3423346</w:t>
+                        <w:t>10:09:34 INFO [bankbot.tools.transaction_tool] account_number=3423346</w:t>
                       </w:r>
                     </w:p>
                     <w:p>
@@ -3019,32 +2637,7 @@
                           <w:sz w:val="22"/>
                           <w:szCs w:val="22"/>
                         </w:rPr>
-                        <w:t>10:09:34 DEBUG [</w:t>
-                      </w:r>
-                      <w:proofErr w:type="spellStart"/>
-                      <w:proofErr w:type="gramStart"/>
-                      <w:r>
-                        <w:rPr>
-                          <w:sz w:val="22"/>
-                          <w:szCs w:val="22"/>
-                        </w:rPr>
-                        <w:t>bankbot.tools</w:t>
-                      </w:r>
-                      <w:proofErr w:type="gramEnd"/>
-                      <w:r>
-                        <w:rPr>
-                          <w:sz w:val="22"/>
-                          <w:szCs w:val="22"/>
-                        </w:rPr>
-                        <w:t>.transaction_tool</w:t>
-                      </w:r>
-                      <w:proofErr w:type="spellEnd"/>
-                      <w:r>
-                        <w:rPr>
-                          <w:sz w:val="22"/>
-                          <w:szCs w:val="22"/>
-                        </w:rPr>
-                        <w:t xml:space="preserve">] Executing search SQL: </w:t>
+                        <w:t xml:space="preserve">10:09:34 DEBUG [bankbot.tools.transaction_tool] Executing search SQL: </w:t>
                       </w:r>
                     </w:p>
                     <w:p>
@@ -3061,87 +2654,7 @@
                           <w:sz w:val="22"/>
                           <w:szCs w:val="22"/>
                         </w:rPr>
-                        <w:t xml:space="preserve">                    Select </w:t>
-                      </w:r>
-                      <w:proofErr w:type="spellStart"/>
-                      <w:r>
-                        <w:rPr>
-                          <w:sz w:val="22"/>
-                          <w:szCs w:val="22"/>
-                        </w:rPr>
-                        <w:t>TransactionId</w:t>
-                      </w:r>
-                      <w:proofErr w:type="spellEnd"/>
-                      <w:r>
-                        <w:rPr>
-                          <w:sz w:val="22"/>
-                          <w:szCs w:val="22"/>
-                        </w:rPr>
-                        <w:t xml:space="preserve"> from </w:t>
-                      </w:r>
-                      <w:proofErr w:type="spellStart"/>
-                      <w:r>
-                        <w:rPr>
-                          <w:sz w:val="22"/>
-                          <w:szCs w:val="22"/>
-                        </w:rPr>
-                        <w:t>banktransaction</w:t>
-                      </w:r>
-                      <w:proofErr w:type="spellEnd"/>
-                      <w:r>
-                        <w:rPr>
-                          <w:sz w:val="22"/>
-                          <w:szCs w:val="22"/>
-                        </w:rPr>
-                        <w:t xml:space="preserve"> where </w:t>
-                      </w:r>
-                      <w:proofErr w:type="spellStart"/>
-                      <w:r>
-                        <w:rPr>
-                          <w:sz w:val="22"/>
-                          <w:szCs w:val="22"/>
-                        </w:rPr>
-                        <w:t>AccountNumber</w:t>
-                      </w:r>
-                      <w:proofErr w:type="spellEnd"/>
-                      <w:r>
-                        <w:rPr>
-                          <w:sz w:val="22"/>
-                          <w:szCs w:val="22"/>
-                        </w:rPr>
-                        <w:t xml:space="preserve"> = %s and </w:t>
-                      </w:r>
-                      <w:proofErr w:type="spellStart"/>
-                      <w:r>
-                        <w:rPr>
-                          <w:sz w:val="22"/>
-                          <w:szCs w:val="22"/>
-                        </w:rPr>
-                        <w:t>TransDateTime</w:t>
-                      </w:r>
-                      <w:proofErr w:type="spellEnd"/>
-                      <w:r>
-                        <w:rPr>
-                          <w:sz w:val="22"/>
-                          <w:szCs w:val="22"/>
-                        </w:rPr>
-                        <w:t xml:space="preserve"> = %s and </w:t>
-                      </w:r>
-                      <w:proofErr w:type="spellStart"/>
-                      <w:r>
-                        <w:rPr>
-                          <w:sz w:val="22"/>
-                          <w:szCs w:val="22"/>
-                        </w:rPr>
-                        <w:t>ReceiverFirstName</w:t>
-                      </w:r>
-                      <w:proofErr w:type="spellEnd"/>
-                      <w:r>
-                        <w:rPr>
-                          <w:sz w:val="22"/>
-                          <w:szCs w:val="22"/>
-                        </w:rPr>
-                        <w:t xml:space="preserve"> = %s and</w:t>
+                        <w:t xml:space="preserve">                    Select TransactionId from banktransaction where AccountNumber = %s and TransDateTime = %s and ReceiverFirstName = %s and</w:t>
                       </w:r>
                     </w:p>
                     <w:p>
@@ -3158,39 +2671,7 @@
                           <w:sz w:val="22"/>
                           <w:szCs w:val="22"/>
                         </w:rPr>
-                        <w:t xml:space="preserve">                    </w:t>
-                      </w:r>
-                      <w:proofErr w:type="spellStart"/>
-                      <w:r>
-                        <w:rPr>
-                          <w:sz w:val="22"/>
-                          <w:szCs w:val="22"/>
-                        </w:rPr>
-                        <w:t>ReceiverLastName</w:t>
-                      </w:r>
-                      <w:proofErr w:type="spellEnd"/>
-                      <w:r>
-                        <w:rPr>
-                          <w:sz w:val="22"/>
-                          <w:szCs w:val="22"/>
-                        </w:rPr>
-                        <w:t xml:space="preserve"> = %s and </w:t>
-                      </w:r>
-                      <w:proofErr w:type="spellStart"/>
-                      <w:r>
-                        <w:rPr>
-                          <w:sz w:val="22"/>
-                          <w:szCs w:val="22"/>
-                        </w:rPr>
-                        <w:t>TransferAmount</w:t>
-                      </w:r>
-                      <w:proofErr w:type="spellEnd"/>
-                      <w:r>
-                        <w:rPr>
-                          <w:sz w:val="22"/>
-                          <w:szCs w:val="22"/>
-                        </w:rPr>
-                        <w:t xml:space="preserve"> = %s</w:t>
+                        <w:t xml:space="preserve">                    ReceiverLastName = %s and TransferAmount = %s</w:t>
                       </w:r>
                     </w:p>
                     <w:p>
@@ -3207,41 +2688,7 @@
                           <w:sz w:val="22"/>
                           <w:szCs w:val="22"/>
                         </w:rPr>
-                        <w:t xml:space="preserve">                 | params</w:t>
-                      </w:r>
-                      <w:proofErr w:type="gramStart"/>
-                      <w:r>
-                        <w:rPr>
-                          <w:sz w:val="22"/>
-                          <w:szCs w:val="22"/>
-                        </w:rPr>
-                        <w:t>=(</w:t>
-                      </w:r>
-                      <w:proofErr w:type="gramEnd"/>
-                      <w:r>
-                        <w:rPr>
-                          <w:sz w:val="22"/>
-                          <w:szCs w:val="22"/>
-                        </w:rPr>
-                        <w:t xml:space="preserve">'3423346', </w:t>
-                      </w:r>
-                      <w:proofErr w:type="spellStart"/>
-                      <w:proofErr w:type="gramStart"/>
-                      <w:r>
-                        <w:rPr>
-                          <w:sz w:val="22"/>
-                          <w:szCs w:val="22"/>
-                        </w:rPr>
-                        <w:t>datetime.datetime</w:t>
-                      </w:r>
-                      <w:proofErr w:type="spellEnd"/>
-                      <w:proofErr w:type="gramEnd"/>
-                      <w:r>
-                        <w:rPr>
-                          <w:sz w:val="22"/>
-                          <w:szCs w:val="22"/>
-                        </w:rPr>
-                        <w:t>(2025, 5, 4, 13, 0, 30), 'Watson', 'Castillo', 345)</w:t>
+                        <w:t xml:space="preserve">                 | params=('3423346', datetime.datetime(2025, 5, 4, 13, 0, 30), 'Watson', 'Castillo', 345)</w:t>
                       </w:r>
                     </w:p>
                     <w:p>
@@ -3258,32 +2705,7 @@
                           <w:sz w:val="22"/>
                           <w:szCs w:val="22"/>
                         </w:rPr>
-                        <w:t>10:09:34 DEBUG [</w:t>
-                      </w:r>
-                      <w:proofErr w:type="spellStart"/>
-                      <w:proofErr w:type="gramStart"/>
-                      <w:r>
-                        <w:rPr>
-                          <w:sz w:val="22"/>
-                          <w:szCs w:val="22"/>
-                        </w:rPr>
-                        <w:t>bankbot.tools</w:t>
-                      </w:r>
-                      <w:proofErr w:type="gramEnd"/>
-                      <w:r>
-                        <w:rPr>
-                          <w:sz w:val="22"/>
-                          <w:szCs w:val="22"/>
-                        </w:rPr>
-                        <w:t>.transaction_tool</w:t>
-                      </w:r>
-                      <w:proofErr w:type="spellEnd"/>
-                      <w:r>
-                        <w:rPr>
-                          <w:sz w:val="22"/>
-                          <w:szCs w:val="22"/>
-                        </w:rPr>
-                        <w:t xml:space="preserve">] Executing update SQL: </w:t>
+                        <w:t xml:space="preserve">10:09:34 DEBUG [bankbot.tools.transaction_tool] Executing update SQL: </w:t>
                       </w:r>
                     </w:p>
                     <w:p>
@@ -3300,55 +2722,7 @@
                           <w:sz w:val="22"/>
                           <w:szCs w:val="22"/>
                         </w:rPr>
-                        <w:t xml:space="preserve">                    Update </w:t>
-                      </w:r>
-                      <w:proofErr w:type="spellStart"/>
-                      <w:r>
-                        <w:rPr>
-                          <w:sz w:val="22"/>
-                          <w:szCs w:val="22"/>
-                        </w:rPr>
-                        <w:t>banktransaction</w:t>
-                      </w:r>
-                      <w:proofErr w:type="spellEnd"/>
-                      <w:r>
-                        <w:rPr>
-                          <w:sz w:val="22"/>
-                          <w:szCs w:val="22"/>
-                        </w:rPr>
-                        <w:t xml:space="preserve"> set </w:t>
-                      </w:r>
-                      <w:proofErr w:type="spellStart"/>
-                      <w:r>
-                        <w:rPr>
-                          <w:sz w:val="22"/>
-                          <w:szCs w:val="22"/>
-                        </w:rPr>
-                        <w:t>TransferStatus</w:t>
-                      </w:r>
-                      <w:proofErr w:type="spellEnd"/>
-                      <w:r>
-                        <w:rPr>
-                          <w:sz w:val="22"/>
-                          <w:szCs w:val="22"/>
-                        </w:rPr>
-                        <w:t xml:space="preserve"> = %s where </w:t>
-                      </w:r>
-                      <w:proofErr w:type="spellStart"/>
-                      <w:r>
-                        <w:rPr>
-                          <w:sz w:val="22"/>
-                          <w:szCs w:val="22"/>
-                        </w:rPr>
-                        <w:t>TransactionId</w:t>
-                      </w:r>
-                      <w:proofErr w:type="spellEnd"/>
-                      <w:r>
-                        <w:rPr>
-                          <w:sz w:val="22"/>
-                          <w:szCs w:val="22"/>
-                        </w:rPr>
-                        <w:t xml:space="preserve"> = %s</w:t>
+                        <w:t xml:space="preserve">                    Update banktransaction set TransferStatus = %s where TransactionId = %s</w:t>
                       </w:r>
                     </w:p>
                     <w:p>
@@ -3365,23 +2739,7 @@
                           <w:sz w:val="22"/>
                           <w:szCs w:val="22"/>
                         </w:rPr>
-                        <w:t xml:space="preserve">                 | params</w:t>
-                      </w:r>
-                      <w:proofErr w:type="gramStart"/>
-                      <w:r>
-                        <w:rPr>
-                          <w:sz w:val="22"/>
-                          <w:szCs w:val="22"/>
-                        </w:rPr>
-                        <w:t>=(</w:t>
-                      </w:r>
-                      <w:proofErr w:type="gramEnd"/>
-                      <w:r>
-                        <w:rPr>
-                          <w:sz w:val="22"/>
-                          <w:szCs w:val="22"/>
-                        </w:rPr>
-                        <w:t>'Disputed', '2368')</w:t>
+                        <w:t xml:space="preserve">                 | params=('Disputed', '2368')</w:t>
                       </w:r>
                     </w:p>
                     <w:p>
@@ -3398,48 +2756,7 @@
                           <w:sz w:val="22"/>
                           <w:szCs w:val="22"/>
                         </w:rPr>
-                        <w:t>10:09:34 DEBUG [</w:t>
-                      </w:r>
-                      <w:proofErr w:type="spellStart"/>
-                      <w:proofErr w:type="gramStart"/>
-                      <w:r>
-                        <w:rPr>
-                          <w:sz w:val="22"/>
-                          <w:szCs w:val="22"/>
-                        </w:rPr>
-                        <w:t>bankbot.tools</w:t>
-                      </w:r>
-                      <w:proofErr w:type="gramEnd"/>
-                      <w:r>
-                        <w:rPr>
-                          <w:sz w:val="22"/>
-                          <w:szCs w:val="22"/>
-                        </w:rPr>
-                        <w:t>.transaction_tool</w:t>
-                      </w:r>
-                      <w:proofErr w:type="spellEnd"/>
-                      <w:r>
-                        <w:rPr>
-                          <w:sz w:val="22"/>
-                          <w:szCs w:val="22"/>
-                        </w:rPr>
-                        <w:t xml:space="preserve">] Executed. </w:t>
-                      </w:r>
-                      <w:proofErr w:type="spellStart"/>
-                      <w:r>
-                        <w:rPr>
-                          <w:sz w:val="22"/>
-                          <w:szCs w:val="22"/>
-                        </w:rPr>
-                        <w:t>rowcount</w:t>
-                      </w:r>
-                      <w:proofErr w:type="spellEnd"/>
-                      <w:r>
-                        <w:rPr>
-                          <w:sz w:val="22"/>
-                          <w:szCs w:val="22"/>
-                        </w:rPr>
-                        <w:t>=1</w:t>
+                        <w:t>10:09:34 DEBUG [bankbot.tools.transaction_tool] Executed. rowcount=1</w:t>
                       </w:r>
                     </w:p>
                   </w:txbxContent>
@@ -3499,23 +2816,7 @@
         <w:t>is</w:t>
       </w:r>
       <w:r>
-        <w:t xml:space="preserve"> written under *.</w:t>
-      </w:r>
-      <w:proofErr w:type="spellStart"/>
-      <w:r>
-        <w:t>py</w:t>
-      </w:r>
-      <w:proofErr w:type="spellEnd"/>
-      <w:r>
-        <w:t xml:space="preserve"> file to be published on a cloud. </w:t>
-      </w:r>
-      <w:proofErr w:type="gramStart"/>
-      <w:r>
-        <w:t>So</w:t>
-      </w:r>
-      <w:proofErr w:type="gramEnd"/>
-      <w:r>
-        <w:t xml:space="preserve"> we need to build an interface to interact with end user</w:t>
+        <w:t xml:space="preserve"> written under *.py file to be published on a cloud. So we need to build an interface to interact with end user</w:t>
       </w:r>
       <w:r>
         <w:t>s</w:t>
@@ -3571,11 +2872,9 @@
       <w:r>
         <w:t xml:space="preserve">LLM Model name: </w:t>
       </w:r>
-      <w:proofErr w:type="spellStart"/>
       <w:r>
         <w:t>AzureChatOpenAI</w:t>
       </w:r>
-      <w:proofErr w:type="spellEnd"/>
     </w:p>
     <w:p>
       <w:pPr>
@@ -3587,15 +2886,7 @@
         <w:ind w:left="810"/>
       </w:pPr>
       <w:r>
-        <w:t xml:space="preserve">Agentic framework: </w:t>
-      </w:r>
-      <w:proofErr w:type="spellStart"/>
-      <w:r>
-        <w:t>LangChain</w:t>
-      </w:r>
-      <w:proofErr w:type="spellEnd"/>
-      <w:r>
-        <w:t xml:space="preserve"> and LangGraph</w:t>
+        <w:t>Agentic framework: LangChain and LangGraph</w:t>
       </w:r>
     </w:p>
     <w:p>
@@ -3610,11 +2901,9 @@
       <w:r>
         <w:t xml:space="preserve">Embedding model: </w:t>
       </w:r>
-      <w:proofErr w:type="spellStart"/>
       <w:r>
         <w:t>MistralAIEmbeddings</w:t>
       </w:r>
-      <w:proofErr w:type="spellEnd"/>
     </w:p>
     <w:p>
       <w:pPr>
@@ -3728,15 +3017,7 @@
         <w:ind w:left="1170"/>
       </w:pPr>
       <w:r>
-        <w:t xml:space="preserve">Build </w:t>
-      </w:r>
-      <w:proofErr w:type="spellStart"/>
-      <w:r>
-        <w:t>a</w:t>
-      </w:r>
-      <w:proofErr w:type="spellEnd"/>
-      <w:r>
-        <w:t xml:space="preserve"> docker image and run it locally</w:t>
+        <w:t>Build a docker image and run it locally</w:t>
       </w:r>
     </w:p>
     <w:p>
@@ -3760,7 +3041,7 @@
       <w:r>
         <w:t xml:space="preserve">Access this link: </w:t>
       </w:r>
-      <w:hyperlink r:id="rId19" w:history="1">
+      <w:hyperlink r:id="rId20" w:history="1">
         <w:r>
           <w:rPr>
             <w:rStyle w:val="Hyperlink"/>

</xml_diff>

<commit_message>
Add model fine tunning feature
</commit_message>
<xml_diff>
--- a/documents/BankingChatBotAgentAIProposal.docx
+++ b/documents/BankingChatBotAgentAIProposal.docx
@@ -96,13 +96,25 @@
         <w:t xml:space="preserve">clarify their issue. If it can’t get the detail issue, it will provide the phone number of live agent </w:t>
       </w:r>
       <w:r>
-        <w:t xml:space="preserve">corresponding to “Other” category </w:t>
+        <w:t>corresponding to “</w:t>
+      </w:r>
+      <w:r>
+        <w:t>general_issues</w:t>
+      </w:r>
+      <w:r>
+        <w:t xml:space="preserve">” category </w:t>
       </w:r>
       <w:r>
         <w:t>to solve.</w:t>
       </w:r>
       <w:r>
-        <w:t xml:space="preserve"> If it can get the detail issue but it can’t support that issue then it will provide the phone number of live agent corresponding to issue’s category to solve</w:t>
+        <w:t xml:space="preserve"> If it get</w:t>
+      </w:r>
+      <w:r>
+        <w:t>s</w:t>
+      </w:r>
+      <w:r>
+        <w:t xml:space="preserve"> the detail issue but it can’t support that issue then it will provide the phone number of live agent corresponding to issue’s category to solve</w:t>
       </w:r>
     </w:p>
     <w:tbl>
@@ -120,7 +132,7 @@
         <w:tblLook w:val="04A0" w:firstRow="1" w:lastRow="0" w:firstColumn="1" w:lastColumn="0" w:noHBand="0" w:noVBand="1"/>
       </w:tblPr>
       <w:tblGrid>
-        <w:gridCol w:w="1960"/>
+        <w:gridCol w:w="2455"/>
         <w:gridCol w:w="2108"/>
       </w:tblGrid>
       <w:tr>
@@ -227,14 +239,12 @@
             </w:pPr>
             <w:r>
               <w:rPr>
-                <w:rFonts w:ascii="Aptos Narrow" w:eastAsia="Times New Roman" w:hAnsi="Aptos Narrow" w:cs="Times New Roman"/>
+                <w:rFonts w:ascii="Aptos Narrow" w:hAnsi="Aptos Narrow"/>
                 <w:color w:val="000000"/>
-                <w:kern w:val="0"/>
                 <w:sz w:val="22"/>
                 <w:szCs w:val="22"/>
-                <w14:ligatures w14:val="none"/>
               </w:rPr>
-              <w:t>bank_account</w:t>
+              <w:t>activate_my_card</w:t>
             </w:r>
           </w:p>
         </w:tc>
@@ -259,12 +269,10 @@
             </w:pPr>
             <w:r>
               <w:rPr>
-                <w:rFonts w:ascii="Aptos Narrow" w:eastAsia="Times New Roman" w:hAnsi="Aptos Narrow" w:cs="Times New Roman"/>
+                <w:rFonts w:ascii="Aptos Narrow" w:hAnsi="Aptos Narrow"/>
                 <w:color w:val="000000"/>
-                <w:kern w:val="0"/>
                 <w:sz w:val="22"/>
                 <w:szCs w:val="22"/>
-                <w14:ligatures w14:val="none"/>
               </w:rPr>
               <w:t>205-123-5678</w:t>
             </w:r>
@@ -296,14 +304,12 @@
             </w:pPr>
             <w:r>
               <w:rPr>
-                <w:rFonts w:ascii="Aptos Narrow" w:eastAsia="Times New Roman" w:hAnsi="Aptos Narrow" w:cs="Times New Roman"/>
+                <w:rFonts w:ascii="Aptos Narrow" w:hAnsi="Aptos Narrow"/>
                 <w:color w:val="000000"/>
-                <w:kern w:val="0"/>
                 <w:sz w:val="22"/>
                 <w:szCs w:val="22"/>
-                <w14:ligatures w14:val="none"/>
               </w:rPr>
-              <w:t>transaction</w:t>
+              <w:t>age_limit</w:t>
             </w:r>
           </w:p>
         </w:tc>
@@ -328,14 +334,12 @@
             </w:pPr>
             <w:r>
               <w:rPr>
-                <w:rFonts w:ascii="Aptos Narrow" w:eastAsia="Times New Roman" w:hAnsi="Aptos Narrow" w:cs="Times New Roman"/>
+                <w:rFonts w:ascii="Aptos Narrow" w:hAnsi="Aptos Narrow"/>
                 <w:color w:val="000000"/>
-                <w:kern w:val="0"/>
                 <w:sz w:val="22"/>
                 <w:szCs w:val="22"/>
-                <w14:ligatures w14:val="none"/>
               </w:rPr>
-              <w:t>205-732-5679</w:t>
+              <w:t>205-123-5679</w:t>
             </w:r>
           </w:p>
         </w:tc>
@@ -365,14 +369,12 @@
             </w:pPr>
             <w:r>
               <w:rPr>
-                <w:rFonts w:ascii="Aptos Narrow" w:eastAsia="Times New Roman" w:hAnsi="Aptos Narrow" w:cs="Times New Roman"/>
+                <w:rFonts w:ascii="Aptos Narrow" w:hAnsi="Aptos Narrow"/>
                 <w:color w:val="000000"/>
-                <w:kern w:val="0"/>
                 <w:sz w:val="22"/>
                 <w:szCs w:val="22"/>
-                <w14:ligatures w14:val="none"/>
               </w:rPr>
-              <w:t>general_issues</w:t>
+              <w:t>apple_pay_or_google_pay</w:t>
             </w:r>
           </w:p>
         </w:tc>
@@ -397,14 +399,12 @@
             </w:pPr>
             <w:r>
               <w:rPr>
-                <w:rFonts w:ascii="Aptos Narrow" w:eastAsia="Times New Roman" w:hAnsi="Aptos Narrow" w:cs="Times New Roman"/>
+                <w:rFonts w:ascii="Aptos Narrow" w:hAnsi="Aptos Narrow"/>
                 <w:color w:val="000000"/>
-                <w:kern w:val="0"/>
                 <w:sz w:val="22"/>
                 <w:szCs w:val="22"/>
-                <w14:ligatures w14:val="none"/>
               </w:rPr>
-              <w:t>205-345-5680</w:t>
+              <w:t>205-123-5680</w:t>
             </w:r>
           </w:p>
         </w:tc>
@@ -434,14 +434,12 @@
             </w:pPr>
             <w:r>
               <w:rPr>
-                <w:rFonts w:ascii="Aptos Narrow" w:eastAsia="Times New Roman" w:hAnsi="Aptos Narrow" w:cs="Times New Roman"/>
+                <w:rFonts w:ascii="Aptos Narrow" w:hAnsi="Aptos Narrow"/>
                 <w:color w:val="000000"/>
-                <w:kern w:val="0"/>
                 <w:sz w:val="22"/>
                 <w:szCs w:val="22"/>
-                <w14:ligatures w14:val="none"/>
               </w:rPr>
-              <w:t>technical_support</w:t>
+              <w:t>atm_support</w:t>
             </w:r>
           </w:p>
         </w:tc>
@@ -466,14 +464,71 @@
             </w:pPr>
             <w:r>
               <w:rPr>
-                <w:rFonts w:ascii="Aptos Narrow" w:eastAsia="Times New Roman" w:hAnsi="Aptos Narrow" w:cs="Times New Roman"/>
+                <w:rFonts w:ascii="Aptos Narrow" w:hAnsi="Aptos Narrow"/>
                 <w:color w:val="000000"/>
-                <w:kern w:val="0"/>
                 <w:sz w:val="22"/>
                 <w:szCs w:val="22"/>
-                <w14:ligatures w14:val="none"/>
               </w:rPr>
-              <w:t>205-789-5681</w:t>
+              <w:t>205-123-5681</w:t>
+            </w:r>
+          </w:p>
+        </w:tc>
+      </w:tr>
+      <w:tr>
+        <w:trPr>
+          <w:trHeight w:val="288"/>
+        </w:trPr>
+        <w:tc>
+          <w:tcPr>
+            <w:tcW w:w="1960" w:type="dxa"/>
+            <w:noWrap/>
+            <w:vAlign w:val="bottom"/>
+          </w:tcPr>
+          <w:p>
+            <w:pPr>
+              <w:spacing w:after="0" w:line="240" w:lineRule="auto"/>
+              <w:rPr>
+                <w:rFonts w:ascii="Aptos Narrow" w:hAnsi="Aptos Narrow"/>
+                <w:color w:val="000000"/>
+                <w:sz w:val="22"/>
+                <w:szCs w:val="22"/>
+              </w:rPr>
+            </w:pPr>
+            <w:r>
+              <w:rPr>
+                <w:rFonts w:ascii="Aptos Narrow" w:hAnsi="Aptos Narrow"/>
+                <w:color w:val="000000"/>
+                <w:sz w:val="22"/>
+                <w:szCs w:val="22"/>
+              </w:rPr>
+              <w:t>…</w:t>
+            </w:r>
+          </w:p>
+        </w:tc>
+        <w:tc>
+          <w:tcPr>
+            <w:tcW w:w="2108" w:type="dxa"/>
+            <w:noWrap/>
+            <w:vAlign w:val="bottom"/>
+          </w:tcPr>
+          <w:p>
+            <w:pPr>
+              <w:spacing w:after="0" w:line="240" w:lineRule="auto"/>
+              <w:rPr>
+                <w:rFonts w:ascii="Aptos Narrow" w:hAnsi="Aptos Narrow"/>
+                <w:color w:val="000000"/>
+                <w:sz w:val="22"/>
+                <w:szCs w:val="22"/>
+              </w:rPr>
+            </w:pPr>
+            <w:r>
+              <w:rPr>
+                <w:rFonts w:ascii="Aptos Narrow" w:hAnsi="Aptos Narrow"/>
+                <w:color w:val="000000"/>
+                <w:sz w:val="22"/>
+                <w:szCs w:val="22"/>
+              </w:rPr>
+              <w:t>…</w:t>
             </w:r>
           </w:p>
         </w:tc>
@@ -512,7 +567,13 @@
         <w:t>issues</w:t>
       </w:r>
       <w:r>
-        <w:t xml:space="preserve"> such as forgot login detail, lost or stolen card, OTP issues..</w:t>
+        <w:t xml:space="preserve"> such as forg</w:t>
+      </w:r>
+      <w:r>
+        <w:t>e</w:t>
+      </w:r>
+      <w:r>
+        <w:t>t login detail, lost or stolen card, OTP issues..</w:t>
       </w:r>
       <w:r>
         <w:t>.</w:t>
@@ -717,6 +778,19 @@
       </w:pPr>
       <w:r>
         <w:t>Sample screenshot:</w:t>
+      </w:r>
+    </w:p>
+    <w:p>
+      <w:pPr>
+        <w:pStyle w:val="ListParagraph"/>
+        <w:numPr>
+          <w:ilvl w:val="2"/>
+          <w:numId w:val="3"/>
+        </w:numPr>
+        <w:ind w:left="1890"/>
+      </w:pPr>
+      <w:r>
+        <w:t>User needs to provide confirmation before data is updated in DB</w:t>
       </w:r>
     </w:p>
     <w:p>
@@ -1548,17 +1622,34 @@
         <w:t xml:space="preserve">: </w:t>
       </w:r>
       <w:r>
-        <w:t>In this case, it refers user to the bank account’s support phone number.</w:t>
-      </w:r>
-    </w:p>
-    <w:p>
-      <w:pPr>
-        <w:pStyle w:val="ListParagraph"/>
-        <w:ind w:left="0"/>
+        <w:t xml:space="preserve">In this case, it refers user to the </w:t>
+      </w:r>
+      <w:r>
         <w:rPr>
           <w:b/>
           <w:bCs/>
         </w:rPr>
+        <w:t>card_not_working</w:t>
+      </w:r>
+      <w:r>
+        <w:rPr>
+          <w:b/>
+          <w:bCs/>
+        </w:rPr>
+        <w:t>’s</w:t>
+      </w:r>
+      <w:r>
+        <w:t xml:space="preserve"> support phone number.</w:t>
+      </w:r>
+    </w:p>
+    <w:p>
+      <w:pPr>
+        <w:pStyle w:val="ListParagraph"/>
+        <w:ind w:left="0"/>
+        <w:rPr>
+          <w:b/>
+          <w:bCs/>
+        </w:rPr>
       </w:pPr>
       <w:r>
         <w:rPr>
@@ -1566,10 +1657,10 @@
         </w:rPr>
         <w:lastRenderedPageBreak/>
         <w:drawing>
-          <wp:inline distT="0" distB="0" distL="0" distR="0" wp14:anchorId="4BC7539A" wp14:editId="4C3B5FC2">
-            <wp:extent cx="6507480" cy="4156166"/>
-            <wp:effectExtent l="0" t="0" r="7620" b="0"/>
-            <wp:docPr id="578067957" name="Picture 1" descr="A screenshot of a chat&#10;&#10;AI-generated content may be incorrect."/>
+          <wp:inline distT="0" distB="0" distL="0" distR="0" wp14:anchorId="3A91496E" wp14:editId="468FC542">
+            <wp:extent cx="5943600" cy="6147435"/>
+            <wp:effectExtent l="0" t="0" r="0" b="5715"/>
+            <wp:docPr id="1295908934" name="Picture 1" descr="A screenshot of a chat&#10;&#10;AI-generated content may be incorrect."/>
             <wp:cNvGraphicFramePr>
               <a:graphicFrameLocks xmlns:a="http://schemas.openxmlformats.org/drawingml/2006/main" noChangeAspect="1"/>
             </wp:cNvGraphicFramePr>
@@ -1577,7 +1668,7 @@
               <a:graphicData uri="http://schemas.openxmlformats.org/drawingml/2006/picture">
                 <pic:pic xmlns:pic="http://schemas.openxmlformats.org/drawingml/2006/picture">
                   <pic:nvPicPr>
-                    <pic:cNvPr id="578067957" name="Picture 1" descr="A screenshot of a chat&#10;&#10;AI-generated content may be incorrect."/>
+                    <pic:cNvPr id="1295908934" name="Picture 1" descr="A screenshot of a chat&#10;&#10;AI-generated content may be incorrect."/>
                     <pic:cNvPicPr/>
                   </pic:nvPicPr>
                   <pic:blipFill>
@@ -1589,7 +1680,7 @@
                   <pic:spPr>
                     <a:xfrm>
                       <a:off x="0" y="0"/>
-                      <a:ext cx="6515807" cy="4161484"/>
+                      <a:ext cx="5943600" cy="6147435"/>
                     </a:xfrm>
                     <a:prstGeom prst="rect">
                       <a:avLst/>
@@ -1859,12 +1950,11 @@
         <w:rPr>
           <w:noProof/>
         </w:rPr>
-        <w:lastRenderedPageBreak/>
         <w:drawing>
-          <wp:inline distT="0" distB="0" distL="0" distR="0" wp14:anchorId="2FBCD578" wp14:editId="174AD3F3">
-            <wp:extent cx="5943600" cy="4376420"/>
-            <wp:effectExtent l="0" t="0" r="0" b="5080"/>
-            <wp:docPr id="795340447" name="Picture 1" descr="A screenshot of a chat&#10;&#10;AI-generated content may be incorrect."/>
+          <wp:inline distT="0" distB="0" distL="0" distR="0" wp14:anchorId="7A182AC1" wp14:editId="56ACB080">
+            <wp:extent cx="5943600" cy="3227705"/>
+            <wp:effectExtent l="0" t="0" r="0" b="0"/>
+            <wp:docPr id="188640232" name="Picture 1" descr="A screenshot of a chat&#10;&#10;AI-generated content may be incorrect."/>
             <wp:cNvGraphicFramePr>
               <a:graphicFrameLocks xmlns:a="http://schemas.openxmlformats.org/drawingml/2006/main" noChangeAspect="1"/>
             </wp:cNvGraphicFramePr>
@@ -1872,7 +1962,7 @@
               <a:graphicData uri="http://schemas.openxmlformats.org/drawingml/2006/picture">
                 <pic:pic xmlns:pic="http://schemas.openxmlformats.org/drawingml/2006/picture">
                   <pic:nvPicPr>
-                    <pic:cNvPr id="795340447" name="Picture 1" descr="A screenshot of a chat&#10;&#10;AI-generated content may be incorrect."/>
+                    <pic:cNvPr id="188640232" name="Picture 1" descr="A screenshot of a chat&#10;&#10;AI-generated content may be incorrect."/>
                     <pic:cNvPicPr/>
                   </pic:nvPicPr>
                   <pic:blipFill>
@@ -1884,7 +1974,7 @@
                   <pic:spPr>
                     <a:xfrm>
                       <a:off x="0" y="0"/>
-                      <a:ext cx="5943600" cy="4376420"/>
+                      <a:ext cx="5943600" cy="3227705"/>
                     </a:xfrm>
                     <a:prstGeom prst="rect">
                       <a:avLst/>
@@ -1930,6 +2020,7 @@
         <w:ind w:left="810"/>
       </w:pPr>
       <w:r>
+        <w:lastRenderedPageBreak/>
         <w:t xml:space="preserve">Primary assistant: </w:t>
       </w:r>
     </w:p>
@@ -2126,7 +2217,6 @@
         <w:ind w:left="810"/>
       </w:pPr>
       <w:r>
-        <w:lastRenderedPageBreak/>
         <w:t>All these agents will work together to answer user’s questions.</w:t>
       </w:r>
     </w:p>
@@ -2256,6 +2346,7 @@
         <w:ind w:left="1170"/>
       </w:pPr>
       <w:r>
+        <w:lastRenderedPageBreak/>
         <w:t xml:space="preserve">The </w:t>
       </w:r>
       <w:r>
@@ -2341,7 +2432,6 @@
         <w:ind w:left="810"/>
       </w:pPr>
       <w:r>
-        <w:lastRenderedPageBreak/>
         <w:t>Using package logging:</w:t>
       </w:r>
     </w:p>
@@ -2810,6 +2900,221 @@
         <w:ind w:left="450" w:hanging="450"/>
       </w:pPr>
       <w:r>
+        <w:t>Fine tuning a pretrained model to get back an intent classification and provide phone support accordingly:</w:t>
+      </w:r>
+    </w:p>
+    <w:p>
+      <w:pPr>
+        <w:pStyle w:val="ListParagraph"/>
+        <w:numPr>
+          <w:ilvl w:val="0"/>
+          <w:numId w:val="10"/>
+        </w:numPr>
+        <w:ind w:left="810"/>
+      </w:pPr>
+      <w:r>
+        <w:t xml:space="preserve">Base model: </w:t>
+      </w:r>
+      <w:r>
+        <w:rPr>
+          <w:b/>
+          <w:bCs/>
+        </w:rPr>
+        <w:t>distilbert-base-uncased</w:t>
+      </w:r>
+    </w:p>
+    <w:p>
+      <w:pPr>
+        <w:pStyle w:val="ListParagraph"/>
+        <w:numPr>
+          <w:ilvl w:val="0"/>
+          <w:numId w:val="10"/>
+        </w:numPr>
+        <w:ind w:left="810"/>
+      </w:pPr>
+      <w:r>
+        <w:t>Apply LoRA technique to reduce number of parameters to be trained</w:t>
+      </w:r>
+    </w:p>
+    <w:p>
+      <w:pPr>
+        <w:pStyle w:val="ListParagraph"/>
+        <w:numPr>
+          <w:ilvl w:val="0"/>
+          <w:numId w:val="10"/>
+        </w:numPr>
+        <w:ind w:left="810"/>
+      </w:pPr>
+      <w:r>
+        <w:t>Use Google Colab to train the banking-intent dataset</w:t>
+      </w:r>
+      <w:r>
+        <w:t xml:space="preserve"> using GPU</w:t>
+      </w:r>
+      <w:r>
+        <w:t xml:space="preserve"> then </w:t>
+      </w:r>
+      <w:r>
+        <w:t>copy</w:t>
+      </w:r>
+      <w:r>
+        <w:t xml:space="preserve"> the best model </w:t>
+      </w:r>
+      <w:r>
+        <w:t xml:space="preserve">configuration </w:t>
+      </w:r>
+      <w:r>
+        <w:t>to the project folder</w:t>
+      </w:r>
+      <w:r>
+        <w:t xml:space="preserve"> (</w:t>
+      </w:r>
+      <w:r>
+        <w:t>models/intent_adapter</w:t>
+      </w:r>
+      <w:r>
+        <w:t>)</w:t>
+      </w:r>
+    </w:p>
+    <w:p>
+      <w:pPr>
+        <w:pStyle w:val="ListParagraph"/>
+        <w:numPr>
+          <w:ilvl w:val="0"/>
+          <w:numId w:val="10"/>
+        </w:numPr>
+        <w:ind w:left="810"/>
+      </w:pPr>
+      <w:r>
+        <w:t>Training performance</w:t>
+      </w:r>
+    </w:p>
+    <w:p>
+      <w:pPr>
+        <w:pStyle w:val="ListParagraph"/>
+        <w:ind w:left="810"/>
+      </w:pPr>
+      <w:r>
+        <w:rPr>
+          <w:noProof/>
+        </w:rPr>
+        <w:lastRenderedPageBreak/>
+        <w:drawing>
+          <wp:inline distT="0" distB="0" distL="0" distR="0" wp14:anchorId="1D3E530E" wp14:editId="2EB060BB">
+            <wp:extent cx="3330229" cy="2796782"/>
+            <wp:effectExtent l="0" t="0" r="3810" b="3810"/>
+            <wp:docPr id="1937380539" name="Picture 1" descr="A table of numbers and symbols&#10;&#10;AI-generated content may be incorrect."/>
+            <wp:cNvGraphicFramePr>
+              <a:graphicFrameLocks xmlns:a="http://schemas.openxmlformats.org/drawingml/2006/main" noChangeAspect="1"/>
+            </wp:cNvGraphicFramePr>
+            <a:graphic xmlns:a="http://schemas.openxmlformats.org/drawingml/2006/main">
+              <a:graphicData uri="http://schemas.openxmlformats.org/drawingml/2006/picture">
+                <pic:pic xmlns:pic="http://schemas.openxmlformats.org/drawingml/2006/picture">
+                  <pic:nvPicPr>
+                    <pic:cNvPr id="1937380539" name="Picture 1" descr="A table of numbers and symbols&#10;&#10;AI-generated content may be incorrect."/>
+                    <pic:cNvPicPr/>
+                  </pic:nvPicPr>
+                  <pic:blipFill>
+                    <a:blip r:embed="rId20"/>
+                    <a:stretch>
+                      <a:fillRect/>
+                    </a:stretch>
+                  </pic:blipFill>
+                  <pic:spPr>
+                    <a:xfrm>
+                      <a:off x="0" y="0"/>
+                      <a:ext cx="3330229" cy="2796782"/>
+                    </a:xfrm>
+                    <a:prstGeom prst="rect">
+                      <a:avLst/>
+                    </a:prstGeom>
+                  </pic:spPr>
+                </pic:pic>
+              </a:graphicData>
+            </a:graphic>
+          </wp:inline>
+        </w:drawing>
+      </w:r>
+    </w:p>
+    <w:p>
+      <w:pPr>
+        <w:pStyle w:val="ListParagraph"/>
+        <w:numPr>
+          <w:ilvl w:val="0"/>
+          <w:numId w:val="10"/>
+        </w:numPr>
+      </w:pPr>
+      <w:r>
+        <w:t>Training loss is converging and gradually reaches to zero</w:t>
+      </w:r>
+      <w:r>
+        <w:t xml:space="preserve"> indicating the low rank matrices help pretrained model learn the training data well</w:t>
+      </w:r>
+    </w:p>
+    <w:p>
+      <w:pPr>
+        <w:pStyle w:val="ListParagraph"/>
+        <w:numPr>
+          <w:ilvl w:val="0"/>
+          <w:numId w:val="10"/>
+        </w:numPr>
+      </w:pPr>
+      <w:r>
+        <w:t>Accuracy rises from 81.6% to 90.7% which is high and stable</w:t>
+      </w:r>
+    </w:p>
+    <w:p>
+      <w:pPr>
+        <w:pStyle w:val="ListParagraph"/>
+        <w:numPr>
+          <w:ilvl w:val="0"/>
+          <w:numId w:val="10"/>
+        </w:numPr>
+      </w:pPr>
+      <w:r>
+        <w:t>After epoch 3, training loss continues to drop sharply while validation loss stop improving and oscillating. Best checkpoint is likely around epoch 6 or 7</w:t>
+      </w:r>
+      <w:r>
+        <w:t>.</w:t>
+      </w:r>
+    </w:p>
+    <w:p>
+      <w:pPr>
+        <w:pStyle w:val="ListParagraph"/>
+        <w:numPr>
+          <w:ilvl w:val="0"/>
+          <w:numId w:val="10"/>
+        </w:numPr>
+      </w:pPr>
+      <w:r>
+        <w:t xml:space="preserve">To improve validation loss, we can </w:t>
+      </w:r>
+      <w:r>
+        <w:t xml:space="preserve">either </w:t>
+      </w:r>
+      <w:r>
+        <w:t>slightly increase the dropout metric</w:t>
+      </w:r>
+      <w:r>
+        <w:t xml:space="preserve"> or lower learning rate or run less epoch.</w:t>
+      </w:r>
+    </w:p>
+    <w:p>
+      <w:pPr>
+        <w:pStyle w:val="ListParagraph"/>
+        <w:ind w:left="810"/>
+      </w:pPr>
+    </w:p>
+    <w:p>
+      <w:pPr>
+        <w:pStyle w:val="ListParagraph"/>
+        <w:numPr>
+          <w:ilvl w:val="0"/>
+          <w:numId w:val="1"/>
+        </w:numPr>
+        <w:ind w:left="450" w:hanging="450"/>
+      </w:pPr>
+      <w:r>
         <w:t xml:space="preserve">The application </w:t>
       </w:r>
       <w:r>
@@ -2915,6 +3220,19 @@
         <w:ind w:left="810"/>
       </w:pPr>
       <w:r>
+        <w:t>Vector DB: Chroma</w:t>
+      </w:r>
+    </w:p>
+    <w:p>
+      <w:pPr>
+        <w:pStyle w:val="ListParagraph"/>
+        <w:numPr>
+          <w:ilvl w:val="0"/>
+          <w:numId w:val="8"/>
+        </w:numPr>
+        <w:ind w:left="810"/>
+      </w:pPr>
+      <w:r>
         <w:t>RAG</w:t>
       </w:r>
       <w:r>
@@ -2932,6 +3250,44 @@
         <w:pStyle w:val="ListParagraph"/>
         <w:numPr>
           <w:ilvl w:val="0"/>
+          <w:numId w:val="8"/>
+        </w:numPr>
+        <w:ind w:left="810"/>
+      </w:pPr>
+      <w:r>
+        <w:t>Front end framework: JS + DOM</w:t>
+      </w:r>
+      <w:r>
+        <w:t xml:space="preserve"> (index.html)</w:t>
+      </w:r>
+      <w:r>
+        <w:t xml:space="preserve">, </w:t>
+      </w:r>
+      <w:r>
+        <w:t>React via CDN</w:t>
+      </w:r>
+      <w:r>
+        <w:t xml:space="preserve"> (login.html)</w:t>
+      </w:r>
+    </w:p>
+    <w:p>
+      <w:pPr>
+        <w:pStyle w:val="ListParagraph"/>
+        <w:numPr>
+          <w:ilvl w:val="0"/>
+          <w:numId w:val="8"/>
+        </w:numPr>
+        <w:ind w:left="810"/>
+      </w:pPr>
+      <w:r>
+        <w:t>Back end framework: FastAPI</w:t>
+      </w:r>
+    </w:p>
+    <w:p>
+      <w:pPr>
+        <w:pStyle w:val="ListParagraph"/>
+        <w:numPr>
+          <w:ilvl w:val="0"/>
           <w:numId w:val="1"/>
         </w:numPr>
         <w:ind w:left="450" w:hanging="450"/>
@@ -2976,6 +3332,7 @@
         <w:ind w:left="810"/>
       </w:pPr>
       <w:r>
+        <w:lastRenderedPageBreak/>
         <w:t xml:space="preserve">Asynchronous working model should be used to </w:t>
       </w:r>
       <w:r>
@@ -2990,6 +3347,51 @@
         <w:pStyle w:val="ListParagraph"/>
         <w:numPr>
           <w:ilvl w:val="0"/>
+          <w:numId w:val="8"/>
+        </w:numPr>
+        <w:ind w:left="810"/>
+      </w:pPr>
+      <w:r>
+        <w:t>Analyze more risks</w:t>
+      </w:r>
+      <w:r>
+        <w:t xml:space="preserve"> and measures to solve problems</w:t>
+      </w:r>
+      <w:r>
+        <w:t xml:space="preserve"> when giving LLM the authority to update DB</w:t>
+      </w:r>
+    </w:p>
+    <w:p>
+      <w:pPr>
+        <w:pStyle w:val="ListParagraph"/>
+        <w:numPr>
+          <w:ilvl w:val="0"/>
+          <w:numId w:val="8"/>
+        </w:numPr>
+        <w:ind w:left="810"/>
+      </w:pPr>
+      <w:r>
+        <w:t>Use 1 front end framework to be consistent in the whole project</w:t>
+      </w:r>
+    </w:p>
+    <w:p>
+      <w:pPr>
+        <w:pStyle w:val="ListParagraph"/>
+        <w:numPr>
+          <w:ilvl w:val="0"/>
+          <w:numId w:val="8"/>
+        </w:numPr>
+        <w:ind w:left="810"/>
+      </w:pPr>
+      <w:r>
+        <w:t>Add more patterns when user says yes/no when confirming an update</w:t>
+      </w:r>
+    </w:p>
+    <w:p>
+      <w:pPr>
+        <w:pStyle w:val="ListParagraph"/>
+        <w:numPr>
+          <w:ilvl w:val="0"/>
           <w:numId w:val="1"/>
         </w:numPr>
         <w:ind w:left="450" w:hanging="450"/>
@@ -3036,12 +3438,92 @@
     <w:p>
       <w:pPr>
         <w:pStyle w:val="ListParagraph"/>
-        <w:ind w:left="810"/>
-      </w:pPr>
-      <w:r>
-        <w:t xml:space="preserve">Access this link: </w:t>
-      </w:r>
-      <w:hyperlink r:id="rId20" w:history="1">
+        <w:numPr>
+          <w:ilvl w:val="0"/>
+          <w:numId w:val="11"/>
+        </w:numPr>
+        <w:ind w:left="1170"/>
+      </w:pPr>
+      <w:r>
+        <w:t xml:space="preserve">Deploy image to </w:t>
+      </w:r>
+      <w:r>
+        <w:rPr>
+          <w:b/>
+          <w:bCs/>
+        </w:rPr>
+        <w:t>Cloud Run</w:t>
+      </w:r>
+    </w:p>
+    <w:p>
+      <w:pPr>
+        <w:pStyle w:val="ListParagraph"/>
+        <w:numPr>
+          <w:ilvl w:val="0"/>
+          <w:numId w:val="11"/>
+        </w:numPr>
+        <w:ind w:left="1170"/>
+      </w:pPr>
+      <w:r>
+        <w:t xml:space="preserve">App connects to </w:t>
+      </w:r>
+      <w:r>
+        <w:rPr>
+          <w:b/>
+          <w:bCs/>
+        </w:rPr>
+        <w:t>Cloud SQL (MySQL)</w:t>
+      </w:r>
+    </w:p>
+    <w:p>
+      <w:pPr>
+        <w:pStyle w:val="ListParagraph"/>
+        <w:numPr>
+          <w:ilvl w:val="0"/>
+          <w:numId w:val="11"/>
+        </w:numPr>
+        <w:ind w:left="1170"/>
+      </w:pPr>
+      <w:r>
+        <w:t xml:space="preserve">Manage access via </w:t>
+      </w:r>
+      <w:r>
+        <w:rPr>
+          <w:b/>
+          <w:bCs/>
+        </w:rPr>
+        <w:t>IAM</w:t>
+      </w:r>
+      <w:r>
+        <w:t xml:space="preserve">, watch logs in </w:t>
+      </w:r>
+      <w:r>
+        <w:rPr>
+          <w:b/>
+          <w:bCs/>
+        </w:rPr>
+        <w:t>Cloud Logging</w:t>
+      </w:r>
+    </w:p>
+    <w:p>
+      <w:pPr>
+        <w:pStyle w:val="ListParagraph"/>
+        <w:numPr>
+          <w:ilvl w:val="0"/>
+          <w:numId w:val="11"/>
+        </w:numPr>
+        <w:ind w:left="1170"/>
+      </w:pPr>
+      <w:r>
+        <w:t>Access this link</w:t>
+      </w:r>
+      <w:r>
+        <w:t xml:space="preserve"> for demo</w:t>
+      </w:r>
+      <w:r>
+        <w:t xml:space="preserve">: </w:t>
+      </w:r>
+      <w:hyperlink r:id="rId21" w:history="1">
         <w:r>
           <w:rPr>
             <w:rStyle w:val="Hyperlink"/>
@@ -3152,6 +3634,119 @@
     </w:lvl>
   </w:abstractNum>
   <w:abstractNum w:abstractNumId="1" w15:restartNumberingAfterBreak="0">
+    <w:nsid w:val="18A94DD0"/>
+    <w:multiLevelType w:val="hybridMultilevel"/>
+    <w:tmpl w:val="ADA4E37A"/>
+    <w:lvl w:ilvl="0" w:tplc="04090001">
+      <w:start w:val="1"/>
+      <w:numFmt w:val="bullet"/>
+      <w:lvlText w:val=""/>
+      <w:lvlJc w:val="left"/>
+      <w:pPr>
+        <w:ind w:left="1170" w:hanging="360"/>
+      </w:pPr>
+      <w:rPr>
+        <w:rFonts w:ascii="Symbol" w:hAnsi="Symbol" w:hint="default"/>
+      </w:rPr>
+    </w:lvl>
+    <w:lvl w:ilvl="1" w:tplc="04090003" w:tentative="1">
+      <w:start w:val="1"/>
+      <w:numFmt w:val="bullet"/>
+      <w:lvlText w:val="o"/>
+      <w:lvlJc w:val="left"/>
+      <w:pPr>
+        <w:ind w:left="1890" w:hanging="360"/>
+      </w:pPr>
+      <w:rPr>
+        <w:rFonts w:ascii="Courier New" w:hAnsi="Courier New" w:cs="Courier New" w:hint="default"/>
+      </w:rPr>
+    </w:lvl>
+    <w:lvl w:ilvl="2" w:tplc="04090005" w:tentative="1">
+      <w:start w:val="1"/>
+      <w:numFmt w:val="bullet"/>
+      <w:lvlText w:val=""/>
+      <w:lvlJc w:val="left"/>
+      <w:pPr>
+        <w:ind w:left="2610" w:hanging="360"/>
+      </w:pPr>
+      <w:rPr>
+        <w:rFonts w:ascii="Wingdings" w:hAnsi="Wingdings" w:hint="default"/>
+      </w:rPr>
+    </w:lvl>
+    <w:lvl w:ilvl="3" w:tplc="04090001" w:tentative="1">
+      <w:start w:val="1"/>
+      <w:numFmt w:val="bullet"/>
+      <w:lvlText w:val=""/>
+      <w:lvlJc w:val="left"/>
+      <w:pPr>
+        <w:ind w:left="3330" w:hanging="360"/>
+      </w:pPr>
+      <w:rPr>
+        <w:rFonts w:ascii="Symbol" w:hAnsi="Symbol" w:hint="default"/>
+      </w:rPr>
+    </w:lvl>
+    <w:lvl w:ilvl="4" w:tplc="04090003" w:tentative="1">
+      <w:start w:val="1"/>
+      <w:numFmt w:val="bullet"/>
+      <w:lvlText w:val="o"/>
+      <w:lvlJc w:val="left"/>
+      <w:pPr>
+        <w:ind w:left="4050" w:hanging="360"/>
+      </w:pPr>
+      <w:rPr>
+        <w:rFonts w:ascii="Courier New" w:hAnsi="Courier New" w:cs="Courier New" w:hint="default"/>
+      </w:rPr>
+    </w:lvl>
+    <w:lvl w:ilvl="5" w:tplc="04090005" w:tentative="1">
+      <w:start w:val="1"/>
+      <w:numFmt w:val="bullet"/>
+      <w:lvlText w:val=""/>
+      <w:lvlJc w:val="left"/>
+      <w:pPr>
+        <w:ind w:left="4770" w:hanging="360"/>
+      </w:pPr>
+      <w:rPr>
+        <w:rFonts w:ascii="Wingdings" w:hAnsi="Wingdings" w:hint="default"/>
+      </w:rPr>
+    </w:lvl>
+    <w:lvl w:ilvl="6" w:tplc="04090001" w:tentative="1">
+      <w:start w:val="1"/>
+      <w:numFmt w:val="bullet"/>
+      <w:lvlText w:val=""/>
+      <w:lvlJc w:val="left"/>
+      <w:pPr>
+        <w:ind w:left="5490" w:hanging="360"/>
+      </w:pPr>
+      <w:rPr>
+        <w:rFonts w:ascii="Symbol" w:hAnsi="Symbol" w:hint="default"/>
+      </w:rPr>
+    </w:lvl>
+    <w:lvl w:ilvl="7" w:tplc="04090003" w:tentative="1">
+      <w:start w:val="1"/>
+      <w:numFmt w:val="bullet"/>
+      <w:lvlText w:val="o"/>
+      <w:lvlJc w:val="left"/>
+      <w:pPr>
+        <w:ind w:left="6210" w:hanging="360"/>
+      </w:pPr>
+      <w:rPr>
+        <w:rFonts w:ascii="Courier New" w:hAnsi="Courier New" w:cs="Courier New" w:hint="default"/>
+      </w:rPr>
+    </w:lvl>
+    <w:lvl w:ilvl="8" w:tplc="04090005" w:tentative="1">
+      <w:start w:val="1"/>
+      <w:numFmt w:val="bullet"/>
+      <w:lvlText w:val=""/>
+      <w:lvlJc w:val="left"/>
+      <w:pPr>
+        <w:ind w:left="6930" w:hanging="360"/>
+      </w:pPr>
+      <w:rPr>
+        <w:rFonts w:ascii="Wingdings" w:hAnsi="Wingdings" w:hint="default"/>
+      </w:rPr>
+    </w:lvl>
+  </w:abstractNum>
+  <w:abstractNum w:abstractNumId="2" w15:restartNumberingAfterBreak="0">
     <w:nsid w:val="20396753"/>
     <w:multiLevelType w:val="hybridMultilevel"/>
     <w:tmpl w:val="4BE64FBE"/>
@@ -3237,7 +3832,120 @@
       </w:pPr>
     </w:lvl>
   </w:abstractNum>
-  <w:abstractNum w:abstractNumId="2" w15:restartNumberingAfterBreak="0">
+  <w:abstractNum w:abstractNumId="3" w15:restartNumberingAfterBreak="0">
+    <w:nsid w:val="2BA643CC"/>
+    <w:multiLevelType w:val="hybridMultilevel"/>
+    <w:tmpl w:val="6B064C74"/>
+    <w:lvl w:ilvl="0" w:tplc="04090001">
+      <w:start w:val="1"/>
+      <w:numFmt w:val="bullet"/>
+      <w:lvlText w:val=""/>
+      <w:lvlJc w:val="left"/>
+      <w:pPr>
+        <w:ind w:left="1530" w:hanging="360"/>
+      </w:pPr>
+      <w:rPr>
+        <w:rFonts w:ascii="Symbol" w:hAnsi="Symbol" w:hint="default"/>
+      </w:rPr>
+    </w:lvl>
+    <w:lvl w:ilvl="1" w:tplc="04090003" w:tentative="1">
+      <w:start w:val="1"/>
+      <w:numFmt w:val="bullet"/>
+      <w:lvlText w:val="o"/>
+      <w:lvlJc w:val="left"/>
+      <w:pPr>
+        <w:ind w:left="2250" w:hanging="360"/>
+      </w:pPr>
+      <w:rPr>
+        <w:rFonts w:ascii="Courier New" w:hAnsi="Courier New" w:cs="Courier New" w:hint="default"/>
+      </w:rPr>
+    </w:lvl>
+    <w:lvl w:ilvl="2" w:tplc="04090005" w:tentative="1">
+      <w:start w:val="1"/>
+      <w:numFmt w:val="bullet"/>
+      <w:lvlText w:val=""/>
+      <w:lvlJc w:val="left"/>
+      <w:pPr>
+        <w:ind w:left="2970" w:hanging="360"/>
+      </w:pPr>
+      <w:rPr>
+        <w:rFonts w:ascii="Wingdings" w:hAnsi="Wingdings" w:hint="default"/>
+      </w:rPr>
+    </w:lvl>
+    <w:lvl w:ilvl="3" w:tplc="04090001" w:tentative="1">
+      <w:start w:val="1"/>
+      <w:numFmt w:val="bullet"/>
+      <w:lvlText w:val=""/>
+      <w:lvlJc w:val="left"/>
+      <w:pPr>
+        <w:ind w:left="3690" w:hanging="360"/>
+      </w:pPr>
+      <w:rPr>
+        <w:rFonts w:ascii="Symbol" w:hAnsi="Symbol" w:hint="default"/>
+      </w:rPr>
+    </w:lvl>
+    <w:lvl w:ilvl="4" w:tplc="04090003" w:tentative="1">
+      <w:start w:val="1"/>
+      <w:numFmt w:val="bullet"/>
+      <w:lvlText w:val="o"/>
+      <w:lvlJc w:val="left"/>
+      <w:pPr>
+        <w:ind w:left="4410" w:hanging="360"/>
+      </w:pPr>
+      <w:rPr>
+        <w:rFonts w:ascii="Courier New" w:hAnsi="Courier New" w:cs="Courier New" w:hint="default"/>
+      </w:rPr>
+    </w:lvl>
+    <w:lvl w:ilvl="5" w:tplc="04090005" w:tentative="1">
+      <w:start w:val="1"/>
+      <w:numFmt w:val="bullet"/>
+      <w:lvlText w:val=""/>
+      <w:lvlJc w:val="left"/>
+      <w:pPr>
+        <w:ind w:left="5130" w:hanging="360"/>
+      </w:pPr>
+      <w:rPr>
+        <w:rFonts w:ascii="Wingdings" w:hAnsi="Wingdings" w:hint="default"/>
+      </w:rPr>
+    </w:lvl>
+    <w:lvl w:ilvl="6" w:tplc="04090001" w:tentative="1">
+      <w:start w:val="1"/>
+      <w:numFmt w:val="bullet"/>
+      <w:lvlText w:val=""/>
+      <w:lvlJc w:val="left"/>
+      <w:pPr>
+        <w:ind w:left="5850" w:hanging="360"/>
+      </w:pPr>
+      <w:rPr>
+        <w:rFonts w:ascii="Symbol" w:hAnsi="Symbol" w:hint="default"/>
+      </w:rPr>
+    </w:lvl>
+    <w:lvl w:ilvl="7" w:tplc="04090003" w:tentative="1">
+      <w:start w:val="1"/>
+      <w:numFmt w:val="bullet"/>
+      <w:lvlText w:val="o"/>
+      <w:lvlJc w:val="left"/>
+      <w:pPr>
+        <w:ind w:left="6570" w:hanging="360"/>
+      </w:pPr>
+      <w:rPr>
+        <w:rFonts w:ascii="Courier New" w:hAnsi="Courier New" w:cs="Courier New" w:hint="default"/>
+      </w:rPr>
+    </w:lvl>
+    <w:lvl w:ilvl="8" w:tplc="04090005" w:tentative="1">
+      <w:start w:val="1"/>
+      <w:numFmt w:val="bullet"/>
+      <w:lvlText w:val=""/>
+      <w:lvlJc w:val="left"/>
+      <w:pPr>
+        <w:ind w:left="7290" w:hanging="360"/>
+      </w:pPr>
+      <w:rPr>
+        <w:rFonts w:ascii="Wingdings" w:hAnsi="Wingdings" w:hint="default"/>
+      </w:rPr>
+    </w:lvl>
+  </w:abstractNum>
+  <w:abstractNum w:abstractNumId="4" w15:restartNumberingAfterBreak="0">
     <w:nsid w:val="32577A9C"/>
     <w:multiLevelType w:val="hybridMultilevel"/>
     <w:tmpl w:val="0E9CF522"/>
@@ -3323,7 +4031,7 @@
       </w:pPr>
     </w:lvl>
   </w:abstractNum>
-  <w:abstractNum w:abstractNumId="3" w15:restartNumberingAfterBreak="0">
+  <w:abstractNum w:abstractNumId="5" w15:restartNumberingAfterBreak="0">
     <w:nsid w:val="3BFE2D3F"/>
     <w:multiLevelType w:val="hybridMultilevel"/>
     <w:tmpl w:val="1A3CD2AE"/>
@@ -3412,7 +4120,7 @@
       </w:pPr>
     </w:lvl>
   </w:abstractNum>
-  <w:abstractNum w:abstractNumId="4" w15:restartNumberingAfterBreak="0">
+  <w:abstractNum w:abstractNumId="6" w15:restartNumberingAfterBreak="0">
     <w:nsid w:val="44AC2F80"/>
     <w:multiLevelType w:val="hybridMultilevel"/>
     <w:tmpl w:val="52AAB092"/>
@@ -3525,7 +4233,7 @@
       </w:rPr>
     </w:lvl>
   </w:abstractNum>
-  <w:abstractNum w:abstractNumId="5" w15:restartNumberingAfterBreak="0">
+  <w:abstractNum w:abstractNumId="7" w15:restartNumberingAfterBreak="0">
     <w:nsid w:val="48D30218"/>
     <w:multiLevelType w:val="hybridMultilevel"/>
     <w:tmpl w:val="E2C68B00"/>
@@ -3614,7 +4322,7 @@
       </w:pPr>
     </w:lvl>
   </w:abstractNum>
-  <w:abstractNum w:abstractNumId="6" w15:restartNumberingAfterBreak="0">
+  <w:abstractNum w:abstractNumId="8" w15:restartNumberingAfterBreak="0">
     <w:nsid w:val="4B7767D6"/>
     <w:multiLevelType w:val="hybridMultilevel"/>
     <w:tmpl w:val="CF185C0E"/>
@@ -3703,7 +4411,7 @@
       </w:pPr>
     </w:lvl>
   </w:abstractNum>
-  <w:abstractNum w:abstractNumId="7" w15:restartNumberingAfterBreak="0">
+  <w:abstractNum w:abstractNumId="9" w15:restartNumberingAfterBreak="0">
     <w:nsid w:val="4D5C196A"/>
     <w:multiLevelType w:val="hybridMultilevel"/>
     <w:tmpl w:val="D1147018"/>
@@ -3816,7 +4524,7 @@
       </w:rPr>
     </w:lvl>
   </w:abstractNum>
-  <w:abstractNum w:abstractNumId="8" w15:restartNumberingAfterBreak="0">
+  <w:abstractNum w:abstractNumId="10" w15:restartNumberingAfterBreak="0">
     <w:nsid w:val="6EE50E83"/>
     <w:multiLevelType w:val="hybridMultilevel"/>
     <w:tmpl w:val="2A5C5760"/>
@@ -3930,31 +4638,37 @@
     </w:lvl>
   </w:abstractNum>
   <w:num w:numId="1" w16cid:durableId="1360276412">
-    <w:abstractNumId w:val="5"/>
+    <w:abstractNumId w:val="7"/>
   </w:num>
   <w:num w:numId="2" w16cid:durableId="321354534">
+    <w:abstractNumId w:val="4"/>
+  </w:num>
+  <w:num w:numId="3" w16cid:durableId="1995142576">
+    <w:abstractNumId w:val="6"/>
+  </w:num>
+  <w:num w:numId="4" w16cid:durableId="1845630439">
+    <w:abstractNumId w:val="8"/>
+  </w:num>
+  <w:num w:numId="5" w16cid:durableId="697974051">
     <w:abstractNumId w:val="2"/>
   </w:num>
-  <w:num w:numId="3" w16cid:durableId="1995142576">
-    <w:abstractNumId w:val="4"/>
-  </w:num>
-  <w:num w:numId="4" w16cid:durableId="1845630439">
-    <w:abstractNumId w:val="6"/>
-  </w:num>
-  <w:num w:numId="5" w16cid:durableId="697974051">
-    <w:abstractNumId w:val="1"/>
-  </w:num>
   <w:num w:numId="6" w16cid:durableId="1052509165">
-    <w:abstractNumId w:val="3"/>
+    <w:abstractNumId w:val="5"/>
   </w:num>
   <w:num w:numId="7" w16cid:durableId="1466697071">
     <w:abstractNumId w:val="0"/>
   </w:num>
   <w:num w:numId="8" w16cid:durableId="1731148716">
-    <w:abstractNumId w:val="8"/>
+    <w:abstractNumId w:val="10"/>
   </w:num>
   <w:num w:numId="9" w16cid:durableId="1502696675">
-    <w:abstractNumId w:val="7"/>
+    <w:abstractNumId w:val="9"/>
+  </w:num>
+  <w:num w:numId="10" w16cid:durableId="620378509">
+    <w:abstractNumId w:val="1"/>
+  </w:num>
+  <w:num w:numId="11" w16cid:durableId="52239889">
+    <w:abstractNumId w:val="3"/>
   </w:num>
 </w:numbering>
 </file>
@@ -4562,7 +5276,6 @@
   <w:style w:type="character" w:default="1" w:styleId="DefaultParagraphFont">
     <w:name w:val="Default Paragraph Font"/>
     <w:uiPriority w:val="1"/>
-    <w:semiHidden/>
     <w:unhideWhenUsed/>
   </w:style>
   <w:style w:type="table" w:default="1" w:styleId="TableNormal">

</xml_diff>

<commit_message>
Merge v2 assets: update app logic and add intent adapter; remove cache artifacts
</commit_message>
<xml_diff>
--- a/documents/BankingChatBotAgentAIProposal.docx
+++ b/documents/BankingChatBotAgentAIProposal.docx
@@ -96,13 +96,25 @@
         <w:t xml:space="preserve">clarify their issue. If it can’t get the detail issue, it will provide the phone number of live agent </w:t>
       </w:r>
       <w:r>
-        <w:t xml:space="preserve">corresponding to “Other” category </w:t>
+        <w:t>corresponding to “</w:t>
+      </w:r>
+      <w:r>
+        <w:t>general_issues</w:t>
+      </w:r>
+      <w:r>
+        <w:t xml:space="preserve">” category </w:t>
       </w:r>
       <w:r>
         <w:t>to solve.</w:t>
       </w:r>
       <w:r>
-        <w:t xml:space="preserve"> If it can get the detail issue but it can’t support that issue then it will provide the phone number of live agent corresponding to issue’s category to solve</w:t>
+        <w:t xml:space="preserve"> If it get</w:t>
+      </w:r>
+      <w:r>
+        <w:t>s</w:t>
+      </w:r>
+      <w:r>
+        <w:t xml:space="preserve"> the detail issue but it can’t support that issue then it will provide the phone number of live agent corresponding to issue’s category to solve</w:t>
       </w:r>
     </w:p>
     <w:tbl>
@@ -120,7 +132,7 @@
         <w:tblLook w:val="04A0" w:firstRow="1" w:lastRow="0" w:firstColumn="1" w:lastColumn="0" w:noHBand="0" w:noVBand="1"/>
       </w:tblPr>
       <w:tblGrid>
-        <w:gridCol w:w="1960"/>
+        <w:gridCol w:w="2455"/>
         <w:gridCol w:w="2108"/>
       </w:tblGrid>
       <w:tr>
@@ -227,14 +239,12 @@
             </w:pPr>
             <w:r>
               <w:rPr>
-                <w:rFonts w:ascii="Aptos Narrow" w:eastAsia="Times New Roman" w:hAnsi="Aptos Narrow" w:cs="Times New Roman"/>
+                <w:rFonts w:ascii="Aptos Narrow" w:hAnsi="Aptos Narrow"/>
                 <w:color w:val="000000"/>
-                <w:kern w:val="0"/>
                 <w:sz w:val="22"/>
                 <w:szCs w:val="22"/>
-                <w14:ligatures w14:val="none"/>
               </w:rPr>
-              <w:t>bank_account</w:t>
+              <w:t>activate_my_card</w:t>
             </w:r>
           </w:p>
         </w:tc>
@@ -259,12 +269,10 @@
             </w:pPr>
             <w:r>
               <w:rPr>
-                <w:rFonts w:ascii="Aptos Narrow" w:eastAsia="Times New Roman" w:hAnsi="Aptos Narrow" w:cs="Times New Roman"/>
+                <w:rFonts w:ascii="Aptos Narrow" w:hAnsi="Aptos Narrow"/>
                 <w:color w:val="000000"/>
-                <w:kern w:val="0"/>
                 <w:sz w:val="22"/>
                 <w:szCs w:val="22"/>
-                <w14:ligatures w14:val="none"/>
               </w:rPr>
               <w:t>205-123-5678</w:t>
             </w:r>
@@ -296,14 +304,12 @@
             </w:pPr>
             <w:r>
               <w:rPr>
-                <w:rFonts w:ascii="Aptos Narrow" w:eastAsia="Times New Roman" w:hAnsi="Aptos Narrow" w:cs="Times New Roman"/>
+                <w:rFonts w:ascii="Aptos Narrow" w:hAnsi="Aptos Narrow"/>
                 <w:color w:val="000000"/>
-                <w:kern w:val="0"/>
                 <w:sz w:val="22"/>
                 <w:szCs w:val="22"/>
-                <w14:ligatures w14:val="none"/>
               </w:rPr>
-              <w:t>transaction</w:t>
+              <w:t>age_limit</w:t>
             </w:r>
           </w:p>
         </w:tc>
@@ -328,14 +334,12 @@
             </w:pPr>
             <w:r>
               <w:rPr>
-                <w:rFonts w:ascii="Aptos Narrow" w:eastAsia="Times New Roman" w:hAnsi="Aptos Narrow" w:cs="Times New Roman"/>
+                <w:rFonts w:ascii="Aptos Narrow" w:hAnsi="Aptos Narrow"/>
                 <w:color w:val="000000"/>
-                <w:kern w:val="0"/>
                 <w:sz w:val="22"/>
                 <w:szCs w:val="22"/>
-                <w14:ligatures w14:val="none"/>
               </w:rPr>
-              <w:t>205-732-5679</w:t>
+              <w:t>205-123-5679</w:t>
             </w:r>
           </w:p>
         </w:tc>
@@ -365,14 +369,12 @@
             </w:pPr>
             <w:r>
               <w:rPr>
-                <w:rFonts w:ascii="Aptos Narrow" w:eastAsia="Times New Roman" w:hAnsi="Aptos Narrow" w:cs="Times New Roman"/>
+                <w:rFonts w:ascii="Aptos Narrow" w:hAnsi="Aptos Narrow"/>
                 <w:color w:val="000000"/>
-                <w:kern w:val="0"/>
                 <w:sz w:val="22"/>
                 <w:szCs w:val="22"/>
-                <w14:ligatures w14:val="none"/>
               </w:rPr>
-              <w:t>general_issues</w:t>
+              <w:t>apple_pay_or_google_pay</w:t>
             </w:r>
           </w:p>
         </w:tc>
@@ -397,14 +399,12 @@
             </w:pPr>
             <w:r>
               <w:rPr>
-                <w:rFonts w:ascii="Aptos Narrow" w:eastAsia="Times New Roman" w:hAnsi="Aptos Narrow" w:cs="Times New Roman"/>
+                <w:rFonts w:ascii="Aptos Narrow" w:hAnsi="Aptos Narrow"/>
                 <w:color w:val="000000"/>
-                <w:kern w:val="0"/>
                 <w:sz w:val="22"/>
                 <w:szCs w:val="22"/>
-                <w14:ligatures w14:val="none"/>
               </w:rPr>
-              <w:t>205-345-5680</w:t>
+              <w:t>205-123-5680</w:t>
             </w:r>
           </w:p>
         </w:tc>
@@ -434,14 +434,12 @@
             </w:pPr>
             <w:r>
               <w:rPr>
-                <w:rFonts w:ascii="Aptos Narrow" w:eastAsia="Times New Roman" w:hAnsi="Aptos Narrow" w:cs="Times New Roman"/>
+                <w:rFonts w:ascii="Aptos Narrow" w:hAnsi="Aptos Narrow"/>
                 <w:color w:val="000000"/>
-                <w:kern w:val="0"/>
                 <w:sz w:val="22"/>
                 <w:szCs w:val="22"/>
-                <w14:ligatures w14:val="none"/>
               </w:rPr>
-              <w:t>technical_support</w:t>
+              <w:t>atm_support</w:t>
             </w:r>
           </w:p>
         </w:tc>
@@ -466,14 +464,71 @@
             </w:pPr>
             <w:r>
               <w:rPr>
-                <w:rFonts w:ascii="Aptos Narrow" w:eastAsia="Times New Roman" w:hAnsi="Aptos Narrow" w:cs="Times New Roman"/>
+                <w:rFonts w:ascii="Aptos Narrow" w:hAnsi="Aptos Narrow"/>
                 <w:color w:val="000000"/>
-                <w:kern w:val="0"/>
                 <w:sz w:val="22"/>
                 <w:szCs w:val="22"/>
-                <w14:ligatures w14:val="none"/>
               </w:rPr>
-              <w:t>205-789-5681</w:t>
+              <w:t>205-123-5681</w:t>
+            </w:r>
+          </w:p>
+        </w:tc>
+      </w:tr>
+      <w:tr>
+        <w:trPr>
+          <w:trHeight w:val="288"/>
+        </w:trPr>
+        <w:tc>
+          <w:tcPr>
+            <w:tcW w:w="1960" w:type="dxa"/>
+            <w:noWrap/>
+            <w:vAlign w:val="bottom"/>
+          </w:tcPr>
+          <w:p>
+            <w:pPr>
+              <w:spacing w:after="0" w:line="240" w:lineRule="auto"/>
+              <w:rPr>
+                <w:rFonts w:ascii="Aptos Narrow" w:hAnsi="Aptos Narrow"/>
+                <w:color w:val="000000"/>
+                <w:sz w:val="22"/>
+                <w:szCs w:val="22"/>
+              </w:rPr>
+            </w:pPr>
+            <w:r>
+              <w:rPr>
+                <w:rFonts w:ascii="Aptos Narrow" w:hAnsi="Aptos Narrow"/>
+                <w:color w:val="000000"/>
+                <w:sz w:val="22"/>
+                <w:szCs w:val="22"/>
+              </w:rPr>
+              <w:t>…</w:t>
+            </w:r>
+          </w:p>
+        </w:tc>
+        <w:tc>
+          <w:tcPr>
+            <w:tcW w:w="2108" w:type="dxa"/>
+            <w:noWrap/>
+            <w:vAlign w:val="bottom"/>
+          </w:tcPr>
+          <w:p>
+            <w:pPr>
+              <w:spacing w:after="0" w:line="240" w:lineRule="auto"/>
+              <w:rPr>
+                <w:rFonts w:ascii="Aptos Narrow" w:hAnsi="Aptos Narrow"/>
+                <w:color w:val="000000"/>
+                <w:sz w:val="22"/>
+                <w:szCs w:val="22"/>
+              </w:rPr>
+            </w:pPr>
+            <w:r>
+              <w:rPr>
+                <w:rFonts w:ascii="Aptos Narrow" w:hAnsi="Aptos Narrow"/>
+                <w:color w:val="000000"/>
+                <w:sz w:val="22"/>
+                <w:szCs w:val="22"/>
+              </w:rPr>
+              <w:t>…</w:t>
             </w:r>
           </w:p>
         </w:tc>
@@ -512,7 +567,13 @@
         <w:t>issues</w:t>
       </w:r>
       <w:r>
-        <w:t xml:space="preserve"> such as forgot login detail, lost or stolen card, OTP issues..</w:t>
+        <w:t xml:space="preserve"> such as forg</w:t>
+      </w:r>
+      <w:r>
+        <w:t>e</w:t>
+      </w:r>
+      <w:r>
+        <w:t>t login detail, lost or stolen card, OTP issues..</w:t>
       </w:r>
       <w:r>
         <w:t>.</w:t>
@@ -717,6 +778,19 @@
       </w:pPr>
       <w:r>
         <w:t>Sample screenshot:</w:t>
+      </w:r>
+    </w:p>
+    <w:p>
+      <w:pPr>
+        <w:pStyle w:val="ListParagraph"/>
+        <w:numPr>
+          <w:ilvl w:val="2"/>
+          <w:numId w:val="3"/>
+        </w:numPr>
+        <w:ind w:left="1890"/>
+      </w:pPr>
+      <w:r>
+        <w:t>User needs to provide confirmation before data is updated in DB</w:t>
       </w:r>
     </w:p>
     <w:p>
@@ -1548,17 +1622,34 @@
         <w:t xml:space="preserve">: </w:t>
       </w:r>
       <w:r>
-        <w:t>In this case, it refers user to the bank account’s support phone number.</w:t>
-      </w:r>
-    </w:p>
-    <w:p>
-      <w:pPr>
-        <w:pStyle w:val="ListParagraph"/>
-        <w:ind w:left="0"/>
+        <w:t xml:space="preserve">In this case, it refers user to the </w:t>
+      </w:r>
+      <w:r>
         <w:rPr>
           <w:b/>
           <w:bCs/>
         </w:rPr>
+        <w:t>card_not_working</w:t>
+      </w:r>
+      <w:r>
+        <w:rPr>
+          <w:b/>
+          <w:bCs/>
+        </w:rPr>
+        <w:t>’s</w:t>
+      </w:r>
+      <w:r>
+        <w:t xml:space="preserve"> support phone number.</w:t>
+      </w:r>
+    </w:p>
+    <w:p>
+      <w:pPr>
+        <w:pStyle w:val="ListParagraph"/>
+        <w:ind w:left="0"/>
+        <w:rPr>
+          <w:b/>
+          <w:bCs/>
+        </w:rPr>
       </w:pPr>
       <w:r>
         <w:rPr>
@@ -1566,10 +1657,10 @@
         </w:rPr>
         <w:lastRenderedPageBreak/>
         <w:drawing>
-          <wp:inline distT="0" distB="0" distL="0" distR="0" wp14:anchorId="4BC7539A" wp14:editId="4C3B5FC2">
-            <wp:extent cx="6507480" cy="4156166"/>
-            <wp:effectExtent l="0" t="0" r="7620" b="0"/>
-            <wp:docPr id="578067957" name="Picture 1" descr="A screenshot of a chat&#10;&#10;AI-generated content may be incorrect."/>
+          <wp:inline distT="0" distB="0" distL="0" distR="0" wp14:anchorId="3A91496E" wp14:editId="468FC542">
+            <wp:extent cx="5943600" cy="6147435"/>
+            <wp:effectExtent l="0" t="0" r="0" b="5715"/>
+            <wp:docPr id="1295908934" name="Picture 1" descr="A screenshot of a chat&#10;&#10;AI-generated content may be incorrect."/>
             <wp:cNvGraphicFramePr>
               <a:graphicFrameLocks xmlns:a="http://schemas.openxmlformats.org/drawingml/2006/main" noChangeAspect="1"/>
             </wp:cNvGraphicFramePr>
@@ -1577,7 +1668,7 @@
               <a:graphicData uri="http://schemas.openxmlformats.org/drawingml/2006/picture">
                 <pic:pic xmlns:pic="http://schemas.openxmlformats.org/drawingml/2006/picture">
                   <pic:nvPicPr>
-                    <pic:cNvPr id="578067957" name="Picture 1" descr="A screenshot of a chat&#10;&#10;AI-generated content may be incorrect."/>
+                    <pic:cNvPr id="1295908934" name="Picture 1" descr="A screenshot of a chat&#10;&#10;AI-generated content may be incorrect."/>
                     <pic:cNvPicPr/>
                   </pic:nvPicPr>
                   <pic:blipFill>
@@ -1589,7 +1680,7 @@
                   <pic:spPr>
                     <a:xfrm>
                       <a:off x="0" y="0"/>
-                      <a:ext cx="6515807" cy="4161484"/>
+                      <a:ext cx="5943600" cy="6147435"/>
                     </a:xfrm>
                     <a:prstGeom prst="rect">
                       <a:avLst/>
@@ -1859,12 +1950,11 @@
         <w:rPr>
           <w:noProof/>
         </w:rPr>
-        <w:lastRenderedPageBreak/>
         <w:drawing>
-          <wp:inline distT="0" distB="0" distL="0" distR="0" wp14:anchorId="2FBCD578" wp14:editId="174AD3F3">
-            <wp:extent cx="5943600" cy="4376420"/>
-            <wp:effectExtent l="0" t="0" r="0" b="5080"/>
-            <wp:docPr id="795340447" name="Picture 1" descr="A screenshot of a chat&#10;&#10;AI-generated content may be incorrect."/>
+          <wp:inline distT="0" distB="0" distL="0" distR="0" wp14:anchorId="7A182AC1" wp14:editId="56ACB080">
+            <wp:extent cx="5943600" cy="3227705"/>
+            <wp:effectExtent l="0" t="0" r="0" b="0"/>
+            <wp:docPr id="188640232" name="Picture 1" descr="A screenshot of a chat&#10;&#10;AI-generated content may be incorrect."/>
             <wp:cNvGraphicFramePr>
               <a:graphicFrameLocks xmlns:a="http://schemas.openxmlformats.org/drawingml/2006/main" noChangeAspect="1"/>
             </wp:cNvGraphicFramePr>
@@ -1872,7 +1962,7 @@
               <a:graphicData uri="http://schemas.openxmlformats.org/drawingml/2006/picture">
                 <pic:pic xmlns:pic="http://schemas.openxmlformats.org/drawingml/2006/picture">
                   <pic:nvPicPr>
-                    <pic:cNvPr id="795340447" name="Picture 1" descr="A screenshot of a chat&#10;&#10;AI-generated content may be incorrect."/>
+                    <pic:cNvPr id="188640232" name="Picture 1" descr="A screenshot of a chat&#10;&#10;AI-generated content may be incorrect."/>
                     <pic:cNvPicPr/>
                   </pic:nvPicPr>
                   <pic:blipFill>
@@ -1884,7 +1974,7 @@
                   <pic:spPr>
                     <a:xfrm>
                       <a:off x="0" y="0"/>
-                      <a:ext cx="5943600" cy="4376420"/>
+                      <a:ext cx="5943600" cy="3227705"/>
                     </a:xfrm>
                     <a:prstGeom prst="rect">
                       <a:avLst/>
@@ -1930,6 +2020,7 @@
         <w:ind w:left="810"/>
       </w:pPr>
       <w:r>
+        <w:lastRenderedPageBreak/>
         <w:t xml:space="preserve">Primary assistant: </w:t>
       </w:r>
     </w:p>
@@ -2126,7 +2217,6 @@
         <w:ind w:left="810"/>
       </w:pPr>
       <w:r>
-        <w:lastRenderedPageBreak/>
         <w:t>All these agents will work together to answer user’s questions.</w:t>
       </w:r>
     </w:p>
@@ -2256,6 +2346,7 @@
         <w:ind w:left="1170"/>
       </w:pPr>
       <w:r>
+        <w:lastRenderedPageBreak/>
         <w:t xml:space="preserve">The </w:t>
       </w:r>
       <w:r>
@@ -2341,7 +2432,6 @@
         <w:ind w:left="810"/>
       </w:pPr>
       <w:r>
-        <w:lastRenderedPageBreak/>
         <w:t>Using package logging:</w:t>
       </w:r>
     </w:p>
@@ -2810,6 +2900,221 @@
         <w:ind w:left="450" w:hanging="450"/>
       </w:pPr>
       <w:r>
+        <w:t>Fine tuning a pretrained model to get back an intent classification and provide phone support accordingly:</w:t>
+      </w:r>
+    </w:p>
+    <w:p>
+      <w:pPr>
+        <w:pStyle w:val="ListParagraph"/>
+        <w:numPr>
+          <w:ilvl w:val="0"/>
+          <w:numId w:val="10"/>
+        </w:numPr>
+        <w:ind w:left="810"/>
+      </w:pPr>
+      <w:r>
+        <w:t xml:space="preserve">Base model: </w:t>
+      </w:r>
+      <w:r>
+        <w:rPr>
+          <w:b/>
+          <w:bCs/>
+        </w:rPr>
+        <w:t>distilbert-base-uncased</w:t>
+      </w:r>
+    </w:p>
+    <w:p>
+      <w:pPr>
+        <w:pStyle w:val="ListParagraph"/>
+        <w:numPr>
+          <w:ilvl w:val="0"/>
+          <w:numId w:val="10"/>
+        </w:numPr>
+        <w:ind w:left="810"/>
+      </w:pPr>
+      <w:r>
+        <w:t>Apply LoRA technique to reduce number of parameters to be trained</w:t>
+      </w:r>
+    </w:p>
+    <w:p>
+      <w:pPr>
+        <w:pStyle w:val="ListParagraph"/>
+        <w:numPr>
+          <w:ilvl w:val="0"/>
+          <w:numId w:val="10"/>
+        </w:numPr>
+        <w:ind w:left="810"/>
+      </w:pPr>
+      <w:r>
+        <w:t>Use Google Colab to train the banking-intent dataset</w:t>
+      </w:r>
+      <w:r>
+        <w:t xml:space="preserve"> using GPU</w:t>
+      </w:r>
+      <w:r>
+        <w:t xml:space="preserve"> then </w:t>
+      </w:r>
+      <w:r>
+        <w:t>copy</w:t>
+      </w:r>
+      <w:r>
+        <w:t xml:space="preserve"> the best model </w:t>
+      </w:r>
+      <w:r>
+        <w:t xml:space="preserve">configuration </w:t>
+      </w:r>
+      <w:r>
+        <w:t>to the project folder</w:t>
+      </w:r>
+      <w:r>
+        <w:t xml:space="preserve"> (</w:t>
+      </w:r>
+      <w:r>
+        <w:t>models/intent_adapter</w:t>
+      </w:r>
+      <w:r>
+        <w:t>)</w:t>
+      </w:r>
+    </w:p>
+    <w:p>
+      <w:pPr>
+        <w:pStyle w:val="ListParagraph"/>
+        <w:numPr>
+          <w:ilvl w:val="0"/>
+          <w:numId w:val="10"/>
+        </w:numPr>
+        <w:ind w:left="810"/>
+      </w:pPr>
+      <w:r>
+        <w:t>Training performance</w:t>
+      </w:r>
+    </w:p>
+    <w:p>
+      <w:pPr>
+        <w:pStyle w:val="ListParagraph"/>
+        <w:ind w:left="810"/>
+      </w:pPr>
+      <w:r>
+        <w:rPr>
+          <w:noProof/>
+        </w:rPr>
+        <w:lastRenderedPageBreak/>
+        <w:drawing>
+          <wp:inline distT="0" distB="0" distL="0" distR="0" wp14:anchorId="1D3E530E" wp14:editId="2EB060BB">
+            <wp:extent cx="3330229" cy="2796782"/>
+            <wp:effectExtent l="0" t="0" r="3810" b="3810"/>
+            <wp:docPr id="1937380539" name="Picture 1" descr="A table of numbers and symbols&#10;&#10;AI-generated content may be incorrect."/>
+            <wp:cNvGraphicFramePr>
+              <a:graphicFrameLocks xmlns:a="http://schemas.openxmlformats.org/drawingml/2006/main" noChangeAspect="1"/>
+            </wp:cNvGraphicFramePr>
+            <a:graphic xmlns:a="http://schemas.openxmlformats.org/drawingml/2006/main">
+              <a:graphicData uri="http://schemas.openxmlformats.org/drawingml/2006/picture">
+                <pic:pic xmlns:pic="http://schemas.openxmlformats.org/drawingml/2006/picture">
+                  <pic:nvPicPr>
+                    <pic:cNvPr id="1937380539" name="Picture 1" descr="A table of numbers and symbols&#10;&#10;AI-generated content may be incorrect."/>
+                    <pic:cNvPicPr/>
+                  </pic:nvPicPr>
+                  <pic:blipFill>
+                    <a:blip r:embed="rId20"/>
+                    <a:stretch>
+                      <a:fillRect/>
+                    </a:stretch>
+                  </pic:blipFill>
+                  <pic:spPr>
+                    <a:xfrm>
+                      <a:off x="0" y="0"/>
+                      <a:ext cx="3330229" cy="2796782"/>
+                    </a:xfrm>
+                    <a:prstGeom prst="rect">
+                      <a:avLst/>
+                    </a:prstGeom>
+                  </pic:spPr>
+                </pic:pic>
+              </a:graphicData>
+            </a:graphic>
+          </wp:inline>
+        </w:drawing>
+      </w:r>
+    </w:p>
+    <w:p>
+      <w:pPr>
+        <w:pStyle w:val="ListParagraph"/>
+        <w:numPr>
+          <w:ilvl w:val="0"/>
+          <w:numId w:val="10"/>
+        </w:numPr>
+      </w:pPr>
+      <w:r>
+        <w:t>Training loss is converging and gradually reaches to zero</w:t>
+      </w:r>
+      <w:r>
+        <w:t xml:space="preserve"> indicating the low rank matrices help pretrained model learn the training data well</w:t>
+      </w:r>
+    </w:p>
+    <w:p>
+      <w:pPr>
+        <w:pStyle w:val="ListParagraph"/>
+        <w:numPr>
+          <w:ilvl w:val="0"/>
+          <w:numId w:val="10"/>
+        </w:numPr>
+      </w:pPr>
+      <w:r>
+        <w:t>Accuracy rises from 81.6% to 90.7% which is high and stable</w:t>
+      </w:r>
+    </w:p>
+    <w:p>
+      <w:pPr>
+        <w:pStyle w:val="ListParagraph"/>
+        <w:numPr>
+          <w:ilvl w:val="0"/>
+          <w:numId w:val="10"/>
+        </w:numPr>
+      </w:pPr>
+      <w:r>
+        <w:t>After epoch 3, training loss continues to drop sharply while validation loss stop improving and oscillating. Best checkpoint is likely around epoch 6 or 7</w:t>
+      </w:r>
+      <w:r>
+        <w:t>.</w:t>
+      </w:r>
+    </w:p>
+    <w:p>
+      <w:pPr>
+        <w:pStyle w:val="ListParagraph"/>
+        <w:numPr>
+          <w:ilvl w:val="0"/>
+          <w:numId w:val="10"/>
+        </w:numPr>
+      </w:pPr>
+      <w:r>
+        <w:t xml:space="preserve">To improve validation loss, we can </w:t>
+      </w:r>
+      <w:r>
+        <w:t xml:space="preserve">either </w:t>
+      </w:r>
+      <w:r>
+        <w:t>slightly increase the dropout metric</w:t>
+      </w:r>
+      <w:r>
+        <w:t xml:space="preserve"> or lower learning rate or run less epoch.</w:t>
+      </w:r>
+    </w:p>
+    <w:p>
+      <w:pPr>
+        <w:pStyle w:val="ListParagraph"/>
+        <w:ind w:left="810"/>
+      </w:pPr>
+    </w:p>
+    <w:p>
+      <w:pPr>
+        <w:pStyle w:val="ListParagraph"/>
+        <w:numPr>
+          <w:ilvl w:val="0"/>
+          <w:numId w:val="1"/>
+        </w:numPr>
+        <w:ind w:left="450" w:hanging="450"/>
+      </w:pPr>
+      <w:r>
         <w:t xml:space="preserve">The application </w:t>
       </w:r>
       <w:r>
@@ -2915,6 +3220,19 @@
         <w:ind w:left="810"/>
       </w:pPr>
       <w:r>
+        <w:t>Vector DB: Chroma</w:t>
+      </w:r>
+    </w:p>
+    <w:p>
+      <w:pPr>
+        <w:pStyle w:val="ListParagraph"/>
+        <w:numPr>
+          <w:ilvl w:val="0"/>
+          <w:numId w:val="8"/>
+        </w:numPr>
+        <w:ind w:left="810"/>
+      </w:pPr>
+      <w:r>
         <w:t>RAG</w:t>
       </w:r>
       <w:r>
@@ -2932,6 +3250,44 @@
         <w:pStyle w:val="ListParagraph"/>
         <w:numPr>
           <w:ilvl w:val="0"/>
+          <w:numId w:val="8"/>
+        </w:numPr>
+        <w:ind w:left="810"/>
+      </w:pPr>
+      <w:r>
+        <w:t>Front end framework: JS + DOM</w:t>
+      </w:r>
+      <w:r>
+        <w:t xml:space="preserve"> (index.html)</w:t>
+      </w:r>
+      <w:r>
+        <w:t xml:space="preserve">, </w:t>
+      </w:r>
+      <w:r>
+        <w:t>React via CDN</w:t>
+      </w:r>
+      <w:r>
+        <w:t xml:space="preserve"> (login.html)</w:t>
+      </w:r>
+    </w:p>
+    <w:p>
+      <w:pPr>
+        <w:pStyle w:val="ListParagraph"/>
+        <w:numPr>
+          <w:ilvl w:val="0"/>
+          <w:numId w:val="8"/>
+        </w:numPr>
+        <w:ind w:left="810"/>
+      </w:pPr>
+      <w:r>
+        <w:t>Back end framework: FastAPI</w:t>
+      </w:r>
+    </w:p>
+    <w:p>
+      <w:pPr>
+        <w:pStyle w:val="ListParagraph"/>
+        <w:numPr>
+          <w:ilvl w:val="0"/>
           <w:numId w:val="1"/>
         </w:numPr>
         <w:ind w:left="450" w:hanging="450"/>
@@ -2976,6 +3332,7 @@
         <w:ind w:left="810"/>
       </w:pPr>
       <w:r>
+        <w:lastRenderedPageBreak/>
         <w:t xml:space="preserve">Asynchronous working model should be used to </w:t>
       </w:r>
       <w:r>
@@ -2990,6 +3347,51 @@
         <w:pStyle w:val="ListParagraph"/>
         <w:numPr>
           <w:ilvl w:val="0"/>
+          <w:numId w:val="8"/>
+        </w:numPr>
+        <w:ind w:left="810"/>
+      </w:pPr>
+      <w:r>
+        <w:t>Analyze more risks</w:t>
+      </w:r>
+      <w:r>
+        <w:t xml:space="preserve"> and measures to solve problems</w:t>
+      </w:r>
+      <w:r>
+        <w:t xml:space="preserve"> when giving LLM the authority to update DB</w:t>
+      </w:r>
+    </w:p>
+    <w:p>
+      <w:pPr>
+        <w:pStyle w:val="ListParagraph"/>
+        <w:numPr>
+          <w:ilvl w:val="0"/>
+          <w:numId w:val="8"/>
+        </w:numPr>
+        <w:ind w:left="810"/>
+      </w:pPr>
+      <w:r>
+        <w:t>Use 1 front end framework to be consistent in the whole project</w:t>
+      </w:r>
+    </w:p>
+    <w:p>
+      <w:pPr>
+        <w:pStyle w:val="ListParagraph"/>
+        <w:numPr>
+          <w:ilvl w:val="0"/>
+          <w:numId w:val="8"/>
+        </w:numPr>
+        <w:ind w:left="810"/>
+      </w:pPr>
+      <w:r>
+        <w:t>Add more patterns when user says yes/no when confirming an update</w:t>
+      </w:r>
+    </w:p>
+    <w:p>
+      <w:pPr>
+        <w:pStyle w:val="ListParagraph"/>
+        <w:numPr>
+          <w:ilvl w:val="0"/>
           <w:numId w:val="1"/>
         </w:numPr>
         <w:ind w:left="450" w:hanging="450"/>
@@ -3036,12 +3438,92 @@
     <w:p>
       <w:pPr>
         <w:pStyle w:val="ListParagraph"/>
-        <w:ind w:left="810"/>
-      </w:pPr>
-      <w:r>
-        <w:t xml:space="preserve">Access this link: </w:t>
-      </w:r>
-      <w:hyperlink r:id="rId20" w:history="1">
+        <w:numPr>
+          <w:ilvl w:val="0"/>
+          <w:numId w:val="11"/>
+        </w:numPr>
+        <w:ind w:left="1170"/>
+      </w:pPr>
+      <w:r>
+        <w:t xml:space="preserve">Deploy image to </w:t>
+      </w:r>
+      <w:r>
+        <w:rPr>
+          <w:b/>
+          <w:bCs/>
+        </w:rPr>
+        <w:t>Cloud Run</w:t>
+      </w:r>
+    </w:p>
+    <w:p>
+      <w:pPr>
+        <w:pStyle w:val="ListParagraph"/>
+        <w:numPr>
+          <w:ilvl w:val="0"/>
+          <w:numId w:val="11"/>
+        </w:numPr>
+        <w:ind w:left="1170"/>
+      </w:pPr>
+      <w:r>
+        <w:t xml:space="preserve">App connects to </w:t>
+      </w:r>
+      <w:r>
+        <w:rPr>
+          <w:b/>
+          <w:bCs/>
+        </w:rPr>
+        <w:t>Cloud SQL (MySQL)</w:t>
+      </w:r>
+    </w:p>
+    <w:p>
+      <w:pPr>
+        <w:pStyle w:val="ListParagraph"/>
+        <w:numPr>
+          <w:ilvl w:val="0"/>
+          <w:numId w:val="11"/>
+        </w:numPr>
+        <w:ind w:left="1170"/>
+      </w:pPr>
+      <w:r>
+        <w:t xml:space="preserve">Manage access via </w:t>
+      </w:r>
+      <w:r>
+        <w:rPr>
+          <w:b/>
+          <w:bCs/>
+        </w:rPr>
+        <w:t>IAM</w:t>
+      </w:r>
+      <w:r>
+        <w:t xml:space="preserve">, watch logs in </w:t>
+      </w:r>
+      <w:r>
+        <w:rPr>
+          <w:b/>
+          <w:bCs/>
+        </w:rPr>
+        <w:t>Cloud Logging</w:t>
+      </w:r>
+    </w:p>
+    <w:p>
+      <w:pPr>
+        <w:pStyle w:val="ListParagraph"/>
+        <w:numPr>
+          <w:ilvl w:val="0"/>
+          <w:numId w:val="11"/>
+        </w:numPr>
+        <w:ind w:left="1170"/>
+      </w:pPr>
+      <w:r>
+        <w:t>Access this link</w:t>
+      </w:r>
+      <w:r>
+        <w:t xml:space="preserve"> for demo</w:t>
+      </w:r>
+      <w:r>
+        <w:t xml:space="preserve">: </w:t>
+      </w:r>
+      <w:hyperlink r:id="rId21" w:history="1">
         <w:r>
           <w:rPr>
             <w:rStyle w:val="Hyperlink"/>
@@ -3152,6 +3634,119 @@
     </w:lvl>
   </w:abstractNum>
   <w:abstractNum w:abstractNumId="1" w15:restartNumberingAfterBreak="0">
+    <w:nsid w:val="18A94DD0"/>
+    <w:multiLevelType w:val="hybridMultilevel"/>
+    <w:tmpl w:val="ADA4E37A"/>
+    <w:lvl w:ilvl="0" w:tplc="04090001">
+      <w:start w:val="1"/>
+      <w:numFmt w:val="bullet"/>
+      <w:lvlText w:val=""/>
+      <w:lvlJc w:val="left"/>
+      <w:pPr>
+        <w:ind w:left="1170" w:hanging="360"/>
+      </w:pPr>
+      <w:rPr>
+        <w:rFonts w:ascii="Symbol" w:hAnsi="Symbol" w:hint="default"/>
+      </w:rPr>
+    </w:lvl>
+    <w:lvl w:ilvl="1" w:tplc="04090003" w:tentative="1">
+      <w:start w:val="1"/>
+      <w:numFmt w:val="bullet"/>
+      <w:lvlText w:val="o"/>
+      <w:lvlJc w:val="left"/>
+      <w:pPr>
+        <w:ind w:left="1890" w:hanging="360"/>
+      </w:pPr>
+      <w:rPr>
+        <w:rFonts w:ascii="Courier New" w:hAnsi="Courier New" w:cs="Courier New" w:hint="default"/>
+      </w:rPr>
+    </w:lvl>
+    <w:lvl w:ilvl="2" w:tplc="04090005" w:tentative="1">
+      <w:start w:val="1"/>
+      <w:numFmt w:val="bullet"/>
+      <w:lvlText w:val=""/>
+      <w:lvlJc w:val="left"/>
+      <w:pPr>
+        <w:ind w:left="2610" w:hanging="360"/>
+      </w:pPr>
+      <w:rPr>
+        <w:rFonts w:ascii="Wingdings" w:hAnsi="Wingdings" w:hint="default"/>
+      </w:rPr>
+    </w:lvl>
+    <w:lvl w:ilvl="3" w:tplc="04090001" w:tentative="1">
+      <w:start w:val="1"/>
+      <w:numFmt w:val="bullet"/>
+      <w:lvlText w:val=""/>
+      <w:lvlJc w:val="left"/>
+      <w:pPr>
+        <w:ind w:left="3330" w:hanging="360"/>
+      </w:pPr>
+      <w:rPr>
+        <w:rFonts w:ascii="Symbol" w:hAnsi="Symbol" w:hint="default"/>
+      </w:rPr>
+    </w:lvl>
+    <w:lvl w:ilvl="4" w:tplc="04090003" w:tentative="1">
+      <w:start w:val="1"/>
+      <w:numFmt w:val="bullet"/>
+      <w:lvlText w:val="o"/>
+      <w:lvlJc w:val="left"/>
+      <w:pPr>
+        <w:ind w:left="4050" w:hanging="360"/>
+      </w:pPr>
+      <w:rPr>
+        <w:rFonts w:ascii="Courier New" w:hAnsi="Courier New" w:cs="Courier New" w:hint="default"/>
+      </w:rPr>
+    </w:lvl>
+    <w:lvl w:ilvl="5" w:tplc="04090005" w:tentative="1">
+      <w:start w:val="1"/>
+      <w:numFmt w:val="bullet"/>
+      <w:lvlText w:val=""/>
+      <w:lvlJc w:val="left"/>
+      <w:pPr>
+        <w:ind w:left="4770" w:hanging="360"/>
+      </w:pPr>
+      <w:rPr>
+        <w:rFonts w:ascii="Wingdings" w:hAnsi="Wingdings" w:hint="default"/>
+      </w:rPr>
+    </w:lvl>
+    <w:lvl w:ilvl="6" w:tplc="04090001" w:tentative="1">
+      <w:start w:val="1"/>
+      <w:numFmt w:val="bullet"/>
+      <w:lvlText w:val=""/>
+      <w:lvlJc w:val="left"/>
+      <w:pPr>
+        <w:ind w:left="5490" w:hanging="360"/>
+      </w:pPr>
+      <w:rPr>
+        <w:rFonts w:ascii="Symbol" w:hAnsi="Symbol" w:hint="default"/>
+      </w:rPr>
+    </w:lvl>
+    <w:lvl w:ilvl="7" w:tplc="04090003" w:tentative="1">
+      <w:start w:val="1"/>
+      <w:numFmt w:val="bullet"/>
+      <w:lvlText w:val="o"/>
+      <w:lvlJc w:val="left"/>
+      <w:pPr>
+        <w:ind w:left="6210" w:hanging="360"/>
+      </w:pPr>
+      <w:rPr>
+        <w:rFonts w:ascii="Courier New" w:hAnsi="Courier New" w:cs="Courier New" w:hint="default"/>
+      </w:rPr>
+    </w:lvl>
+    <w:lvl w:ilvl="8" w:tplc="04090005" w:tentative="1">
+      <w:start w:val="1"/>
+      <w:numFmt w:val="bullet"/>
+      <w:lvlText w:val=""/>
+      <w:lvlJc w:val="left"/>
+      <w:pPr>
+        <w:ind w:left="6930" w:hanging="360"/>
+      </w:pPr>
+      <w:rPr>
+        <w:rFonts w:ascii="Wingdings" w:hAnsi="Wingdings" w:hint="default"/>
+      </w:rPr>
+    </w:lvl>
+  </w:abstractNum>
+  <w:abstractNum w:abstractNumId="2" w15:restartNumberingAfterBreak="0">
     <w:nsid w:val="20396753"/>
     <w:multiLevelType w:val="hybridMultilevel"/>
     <w:tmpl w:val="4BE64FBE"/>
@@ -3237,7 +3832,120 @@
       </w:pPr>
     </w:lvl>
   </w:abstractNum>
-  <w:abstractNum w:abstractNumId="2" w15:restartNumberingAfterBreak="0">
+  <w:abstractNum w:abstractNumId="3" w15:restartNumberingAfterBreak="0">
+    <w:nsid w:val="2BA643CC"/>
+    <w:multiLevelType w:val="hybridMultilevel"/>
+    <w:tmpl w:val="6B064C74"/>
+    <w:lvl w:ilvl="0" w:tplc="04090001">
+      <w:start w:val="1"/>
+      <w:numFmt w:val="bullet"/>
+      <w:lvlText w:val=""/>
+      <w:lvlJc w:val="left"/>
+      <w:pPr>
+        <w:ind w:left="1530" w:hanging="360"/>
+      </w:pPr>
+      <w:rPr>
+        <w:rFonts w:ascii="Symbol" w:hAnsi="Symbol" w:hint="default"/>
+      </w:rPr>
+    </w:lvl>
+    <w:lvl w:ilvl="1" w:tplc="04090003" w:tentative="1">
+      <w:start w:val="1"/>
+      <w:numFmt w:val="bullet"/>
+      <w:lvlText w:val="o"/>
+      <w:lvlJc w:val="left"/>
+      <w:pPr>
+        <w:ind w:left="2250" w:hanging="360"/>
+      </w:pPr>
+      <w:rPr>
+        <w:rFonts w:ascii="Courier New" w:hAnsi="Courier New" w:cs="Courier New" w:hint="default"/>
+      </w:rPr>
+    </w:lvl>
+    <w:lvl w:ilvl="2" w:tplc="04090005" w:tentative="1">
+      <w:start w:val="1"/>
+      <w:numFmt w:val="bullet"/>
+      <w:lvlText w:val=""/>
+      <w:lvlJc w:val="left"/>
+      <w:pPr>
+        <w:ind w:left="2970" w:hanging="360"/>
+      </w:pPr>
+      <w:rPr>
+        <w:rFonts w:ascii="Wingdings" w:hAnsi="Wingdings" w:hint="default"/>
+      </w:rPr>
+    </w:lvl>
+    <w:lvl w:ilvl="3" w:tplc="04090001" w:tentative="1">
+      <w:start w:val="1"/>
+      <w:numFmt w:val="bullet"/>
+      <w:lvlText w:val=""/>
+      <w:lvlJc w:val="left"/>
+      <w:pPr>
+        <w:ind w:left="3690" w:hanging="360"/>
+      </w:pPr>
+      <w:rPr>
+        <w:rFonts w:ascii="Symbol" w:hAnsi="Symbol" w:hint="default"/>
+      </w:rPr>
+    </w:lvl>
+    <w:lvl w:ilvl="4" w:tplc="04090003" w:tentative="1">
+      <w:start w:val="1"/>
+      <w:numFmt w:val="bullet"/>
+      <w:lvlText w:val="o"/>
+      <w:lvlJc w:val="left"/>
+      <w:pPr>
+        <w:ind w:left="4410" w:hanging="360"/>
+      </w:pPr>
+      <w:rPr>
+        <w:rFonts w:ascii="Courier New" w:hAnsi="Courier New" w:cs="Courier New" w:hint="default"/>
+      </w:rPr>
+    </w:lvl>
+    <w:lvl w:ilvl="5" w:tplc="04090005" w:tentative="1">
+      <w:start w:val="1"/>
+      <w:numFmt w:val="bullet"/>
+      <w:lvlText w:val=""/>
+      <w:lvlJc w:val="left"/>
+      <w:pPr>
+        <w:ind w:left="5130" w:hanging="360"/>
+      </w:pPr>
+      <w:rPr>
+        <w:rFonts w:ascii="Wingdings" w:hAnsi="Wingdings" w:hint="default"/>
+      </w:rPr>
+    </w:lvl>
+    <w:lvl w:ilvl="6" w:tplc="04090001" w:tentative="1">
+      <w:start w:val="1"/>
+      <w:numFmt w:val="bullet"/>
+      <w:lvlText w:val=""/>
+      <w:lvlJc w:val="left"/>
+      <w:pPr>
+        <w:ind w:left="5850" w:hanging="360"/>
+      </w:pPr>
+      <w:rPr>
+        <w:rFonts w:ascii="Symbol" w:hAnsi="Symbol" w:hint="default"/>
+      </w:rPr>
+    </w:lvl>
+    <w:lvl w:ilvl="7" w:tplc="04090003" w:tentative="1">
+      <w:start w:val="1"/>
+      <w:numFmt w:val="bullet"/>
+      <w:lvlText w:val="o"/>
+      <w:lvlJc w:val="left"/>
+      <w:pPr>
+        <w:ind w:left="6570" w:hanging="360"/>
+      </w:pPr>
+      <w:rPr>
+        <w:rFonts w:ascii="Courier New" w:hAnsi="Courier New" w:cs="Courier New" w:hint="default"/>
+      </w:rPr>
+    </w:lvl>
+    <w:lvl w:ilvl="8" w:tplc="04090005" w:tentative="1">
+      <w:start w:val="1"/>
+      <w:numFmt w:val="bullet"/>
+      <w:lvlText w:val=""/>
+      <w:lvlJc w:val="left"/>
+      <w:pPr>
+        <w:ind w:left="7290" w:hanging="360"/>
+      </w:pPr>
+      <w:rPr>
+        <w:rFonts w:ascii="Wingdings" w:hAnsi="Wingdings" w:hint="default"/>
+      </w:rPr>
+    </w:lvl>
+  </w:abstractNum>
+  <w:abstractNum w:abstractNumId="4" w15:restartNumberingAfterBreak="0">
     <w:nsid w:val="32577A9C"/>
     <w:multiLevelType w:val="hybridMultilevel"/>
     <w:tmpl w:val="0E9CF522"/>
@@ -3323,7 +4031,7 @@
       </w:pPr>
     </w:lvl>
   </w:abstractNum>
-  <w:abstractNum w:abstractNumId="3" w15:restartNumberingAfterBreak="0">
+  <w:abstractNum w:abstractNumId="5" w15:restartNumberingAfterBreak="0">
     <w:nsid w:val="3BFE2D3F"/>
     <w:multiLevelType w:val="hybridMultilevel"/>
     <w:tmpl w:val="1A3CD2AE"/>
@@ -3412,7 +4120,7 @@
       </w:pPr>
     </w:lvl>
   </w:abstractNum>
-  <w:abstractNum w:abstractNumId="4" w15:restartNumberingAfterBreak="0">
+  <w:abstractNum w:abstractNumId="6" w15:restartNumberingAfterBreak="0">
     <w:nsid w:val="44AC2F80"/>
     <w:multiLevelType w:val="hybridMultilevel"/>
     <w:tmpl w:val="52AAB092"/>
@@ -3525,7 +4233,7 @@
       </w:rPr>
     </w:lvl>
   </w:abstractNum>
-  <w:abstractNum w:abstractNumId="5" w15:restartNumberingAfterBreak="0">
+  <w:abstractNum w:abstractNumId="7" w15:restartNumberingAfterBreak="0">
     <w:nsid w:val="48D30218"/>
     <w:multiLevelType w:val="hybridMultilevel"/>
     <w:tmpl w:val="E2C68B00"/>
@@ -3614,7 +4322,7 @@
       </w:pPr>
     </w:lvl>
   </w:abstractNum>
-  <w:abstractNum w:abstractNumId="6" w15:restartNumberingAfterBreak="0">
+  <w:abstractNum w:abstractNumId="8" w15:restartNumberingAfterBreak="0">
     <w:nsid w:val="4B7767D6"/>
     <w:multiLevelType w:val="hybridMultilevel"/>
     <w:tmpl w:val="CF185C0E"/>
@@ -3703,7 +4411,7 @@
       </w:pPr>
     </w:lvl>
   </w:abstractNum>
-  <w:abstractNum w:abstractNumId="7" w15:restartNumberingAfterBreak="0">
+  <w:abstractNum w:abstractNumId="9" w15:restartNumberingAfterBreak="0">
     <w:nsid w:val="4D5C196A"/>
     <w:multiLevelType w:val="hybridMultilevel"/>
     <w:tmpl w:val="D1147018"/>
@@ -3816,7 +4524,7 @@
       </w:rPr>
     </w:lvl>
   </w:abstractNum>
-  <w:abstractNum w:abstractNumId="8" w15:restartNumberingAfterBreak="0">
+  <w:abstractNum w:abstractNumId="10" w15:restartNumberingAfterBreak="0">
     <w:nsid w:val="6EE50E83"/>
     <w:multiLevelType w:val="hybridMultilevel"/>
     <w:tmpl w:val="2A5C5760"/>
@@ -3930,31 +4638,37 @@
     </w:lvl>
   </w:abstractNum>
   <w:num w:numId="1" w16cid:durableId="1360276412">
-    <w:abstractNumId w:val="5"/>
+    <w:abstractNumId w:val="7"/>
   </w:num>
   <w:num w:numId="2" w16cid:durableId="321354534">
+    <w:abstractNumId w:val="4"/>
+  </w:num>
+  <w:num w:numId="3" w16cid:durableId="1995142576">
+    <w:abstractNumId w:val="6"/>
+  </w:num>
+  <w:num w:numId="4" w16cid:durableId="1845630439">
+    <w:abstractNumId w:val="8"/>
+  </w:num>
+  <w:num w:numId="5" w16cid:durableId="697974051">
     <w:abstractNumId w:val="2"/>
   </w:num>
-  <w:num w:numId="3" w16cid:durableId="1995142576">
-    <w:abstractNumId w:val="4"/>
-  </w:num>
-  <w:num w:numId="4" w16cid:durableId="1845630439">
-    <w:abstractNumId w:val="6"/>
-  </w:num>
-  <w:num w:numId="5" w16cid:durableId="697974051">
-    <w:abstractNumId w:val="1"/>
-  </w:num>
   <w:num w:numId="6" w16cid:durableId="1052509165">
-    <w:abstractNumId w:val="3"/>
+    <w:abstractNumId w:val="5"/>
   </w:num>
   <w:num w:numId="7" w16cid:durableId="1466697071">
     <w:abstractNumId w:val="0"/>
   </w:num>
   <w:num w:numId="8" w16cid:durableId="1731148716">
-    <w:abstractNumId w:val="8"/>
+    <w:abstractNumId w:val="10"/>
   </w:num>
   <w:num w:numId="9" w16cid:durableId="1502696675">
-    <w:abstractNumId w:val="7"/>
+    <w:abstractNumId w:val="9"/>
+  </w:num>
+  <w:num w:numId="10" w16cid:durableId="620378509">
+    <w:abstractNumId w:val="1"/>
+  </w:num>
+  <w:num w:numId="11" w16cid:durableId="52239889">
+    <w:abstractNumId w:val="3"/>
   </w:num>
 </w:numbering>
 </file>
@@ -4562,7 +5276,6 @@
   <w:style w:type="character" w:default="1" w:styleId="DefaultParagraphFont">
     <w:name w:val="Default Paragraph Font"/>
     <w:uiPriority w:val="1"/>
-    <w:semiHidden/>
     <w:unhideWhenUsed/>
   </w:style>
   <w:style w:type="table" w:default="1" w:styleId="TableNormal">

</xml_diff>

<commit_message>
add multi reasoning process
</commit_message>
<xml_diff>
--- a/documents/BankingChatBotAgentAIProposal.docx
+++ b/documents/BankingChatBotAgentAIProposal.docx
@@ -87,20 +87,38 @@
         </w:numPr>
       </w:pPr>
       <w:r>
-        <w:t xml:space="preserve">If user asks too general questions like technical issues, need to ask a question, need to see an agent,… then the AI will </w:t>
+        <w:t xml:space="preserve">If user asks too general questions like technical issues, need to ask a question, need to see an </w:t>
+      </w:r>
+      <w:proofErr w:type="gramStart"/>
+      <w:r>
+        <w:t>agent,…</w:t>
+      </w:r>
+      <w:proofErr w:type="gramEnd"/>
+      <w:r>
+        <w:t xml:space="preserve"> then the AI will </w:t>
       </w:r>
       <w:r>
         <w:t xml:space="preserve">try to </w:t>
       </w:r>
       <w:r>
-        <w:t xml:space="preserve">clarify their issue. If it can’t get the detail issue, it will provide the phone number of live agent </w:t>
+        <w:t xml:space="preserve">clarify their issue. If it can’t get the detail issue, it will provide the phone number of live </w:t>
+      </w:r>
+      <w:proofErr w:type="gramStart"/>
+      <w:r>
+        <w:t>agent</w:t>
+      </w:r>
+      <w:proofErr w:type="gramEnd"/>
+      <w:r>
+        <w:t xml:space="preserve"> </w:t>
       </w:r>
       <w:r>
         <w:t>corresponding to “</w:t>
       </w:r>
+      <w:proofErr w:type="spellStart"/>
       <w:r>
         <w:t>general_issues</w:t>
       </w:r>
+      <w:proofErr w:type="spellEnd"/>
       <w:r>
         <w:t xml:space="preserve">” category </w:t>
       </w:r>
@@ -114,7 +132,23 @@
         <w:t>s</w:t>
       </w:r>
       <w:r>
-        <w:t xml:space="preserve"> the detail issue but it can’t support that issue then it will provide the phone number of live agent corresponding to issue’s category to solve</w:t>
+        <w:t xml:space="preserve"> the detail issue but it can’t support that </w:t>
+      </w:r>
+      <w:proofErr w:type="gramStart"/>
+      <w:r>
+        <w:t>issue</w:t>
+      </w:r>
+      <w:proofErr w:type="gramEnd"/>
+      <w:r>
+        <w:t xml:space="preserve"> then it will provide the phone number of live </w:t>
+      </w:r>
+      <w:proofErr w:type="gramStart"/>
+      <w:r>
+        <w:t>agent</w:t>
+      </w:r>
+      <w:proofErr w:type="gramEnd"/>
+      <w:r>
+        <w:t xml:space="preserve"> corresponding to issue’s category to solve</w:t>
       </w:r>
     </w:p>
     <w:tbl>
@@ -198,6 +232,7 @@
                 <w14:ligatures w14:val="none"/>
               </w:rPr>
             </w:pPr>
+            <w:proofErr w:type="spellStart"/>
             <w:r>
               <w:rPr>
                 <w:rFonts w:ascii="Aptos Narrow" w:eastAsia="Times New Roman" w:hAnsi="Aptos Narrow" w:cs="Times New Roman"/>
@@ -211,6 +246,7 @@
               </w:rPr>
               <w:t>PhoneNum</w:t>
             </w:r>
+            <w:proofErr w:type="spellEnd"/>
           </w:p>
         </w:tc>
       </w:tr>
@@ -237,6 +273,7 @@
                 <w14:ligatures w14:val="none"/>
               </w:rPr>
             </w:pPr>
+            <w:proofErr w:type="spellStart"/>
             <w:r>
               <w:rPr>
                 <w:rFonts w:ascii="Aptos Narrow" w:hAnsi="Aptos Narrow"/>
@@ -246,6 +283,7 @@
               </w:rPr>
               <w:t>activate_my_card</w:t>
             </w:r>
+            <w:proofErr w:type="spellEnd"/>
           </w:p>
         </w:tc>
         <w:tc>
@@ -302,6 +340,7 @@
                 <w14:ligatures w14:val="none"/>
               </w:rPr>
             </w:pPr>
+            <w:proofErr w:type="spellStart"/>
             <w:r>
               <w:rPr>
                 <w:rFonts w:ascii="Aptos Narrow" w:hAnsi="Aptos Narrow"/>
@@ -311,6 +350,7 @@
               </w:rPr>
               <w:t>age_limit</w:t>
             </w:r>
+            <w:proofErr w:type="spellEnd"/>
           </w:p>
         </w:tc>
         <w:tc>
@@ -367,6 +407,7 @@
                 <w14:ligatures w14:val="none"/>
               </w:rPr>
             </w:pPr>
+            <w:proofErr w:type="spellStart"/>
             <w:r>
               <w:rPr>
                 <w:rFonts w:ascii="Aptos Narrow" w:hAnsi="Aptos Narrow"/>
@@ -376,6 +417,7 @@
               </w:rPr>
               <w:t>apple_pay_or_google_pay</w:t>
             </w:r>
+            <w:proofErr w:type="spellEnd"/>
           </w:p>
         </w:tc>
         <w:tc>
@@ -432,6 +474,7 @@
                 <w14:ligatures w14:val="none"/>
               </w:rPr>
             </w:pPr>
+            <w:proofErr w:type="spellStart"/>
             <w:r>
               <w:rPr>
                 <w:rFonts w:ascii="Aptos Narrow" w:hAnsi="Aptos Narrow"/>
@@ -441,6 +484,7 @@
               </w:rPr>
               <w:t>atm_support</w:t>
             </w:r>
+            <w:proofErr w:type="spellEnd"/>
           </w:p>
         </w:tc>
         <w:tc>
@@ -763,9 +807,11 @@
         </w:numPr>
         <w:ind w:left="1890"/>
       </w:pPr>
+      <w:proofErr w:type="spellStart"/>
       <w:r>
         <w:t>InforMsg</w:t>
       </w:r>
+      <w:proofErr w:type="spellEnd"/>
     </w:p>
     <w:p>
       <w:pPr>
@@ -1156,11 +1202,16 @@
         </w:numPr>
         <w:ind w:left="2250"/>
       </w:pPr>
+      <w:proofErr w:type="gramStart"/>
       <w:r>
         <w:t xml:space="preserve">Date </w:t>
       </w:r>
       <w:r>
-        <w:t xml:space="preserve">time </w:t>
+        <w:t>time</w:t>
+      </w:r>
+      <w:proofErr w:type="gramEnd"/>
+      <w:r>
+        <w:t xml:space="preserve"> </w:t>
       </w:r>
       <w:r>
         <w:t>of transaction</w:t>
@@ -1202,7 +1253,15 @@
         <w:ind w:left="2250"/>
       </w:pPr>
       <w:r>
-        <w:t>Status of transaction (SENT, DISPUTED,PENDING)</w:t>
+        <w:t xml:space="preserve">Status of transaction (SENT, </w:t>
+      </w:r>
+      <w:proofErr w:type="gramStart"/>
+      <w:r>
+        <w:t>DISPUTED,PENDING</w:t>
+      </w:r>
+      <w:proofErr w:type="gramEnd"/>
+      <w:r>
+        <w:t>)</w:t>
       </w:r>
     </w:p>
     <w:p>
@@ -1330,8 +1389,13 @@
         </w:numPr>
         <w:ind w:left="1890"/>
       </w:pPr>
-      <w:r>
-        <w:t>Date time of transaction</w:t>
+      <w:proofErr w:type="gramStart"/>
+      <w:r>
+        <w:t>Date time</w:t>
+      </w:r>
+      <w:proofErr w:type="gramEnd"/>
+      <w:r>
+        <w:t xml:space="preserve"> of transaction</w:t>
       </w:r>
     </w:p>
     <w:p>
@@ -1382,9 +1446,11 @@
         </w:numPr>
         <w:ind w:left="1890"/>
       </w:pPr>
+      <w:proofErr w:type="spellStart"/>
       <w:r>
         <w:t>InforMsg</w:t>
       </w:r>
+      <w:proofErr w:type="spellEnd"/>
     </w:p>
     <w:p>
       <w:pPr>
@@ -1396,14 +1462,23 @@
         <w:ind w:left="1530"/>
       </w:pPr>
       <w:r>
-        <w:t>Sample screenshot:</w:t>
-      </w:r>
-    </w:p>
-    <w:p>
-      <w:pPr>
-        <w:pStyle w:val="ListParagraph"/>
-        <w:ind w:left="1440"/>
-      </w:pPr>
+        <w:t>Multi step reasoning:</w:t>
+      </w:r>
+    </w:p>
+    <w:p>
+      <w:pPr>
+        <w:pStyle w:val="ListParagraph"/>
+        <w:numPr>
+          <w:ilvl w:val="2"/>
+          <w:numId w:val="3"/>
+        </w:numPr>
+        <w:ind w:left="1890"/>
+      </w:pPr>
+      <w:proofErr w:type="gramStart"/>
+      <w:r>
+        <w:t>Work flow</w:t>
+      </w:r>
+      <w:proofErr w:type="gramEnd"/>
     </w:p>
     <w:p>
       <w:pPr>
@@ -1416,10 +1491,10 @@
         </w:rPr>
         <w:lastRenderedPageBreak/>
         <w:drawing>
-          <wp:inline distT="0" distB="0" distL="0" distR="0" wp14:anchorId="6A9D4920" wp14:editId="58FED3D4">
-            <wp:extent cx="6484620" cy="4176899"/>
-            <wp:effectExtent l="0" t="0" r="0" b="0"/>
-            <wp:docPr id="1777766022" name="Picture 1" descr="A screenshot of a chat&#10;&#10;AI-generated content may be incorrect."/>
+          <wp:inline distT="0" distB="0" distL="0" distR="0" wp14:anchorId="74EF0F14" wp14:editId="0D1B7C47">
+            <wp:extent cx="6625021" cy="3684814"/>
+            <wp:effectExtent l="0" t="0" r="4445" b="0"/>
+            <wp:docPr id="1562815009" name="Picture 1"/>
             <wp:cNvGraphicFramePr>
               <a:graphicFrameLocks xmlns:a="http://schemas.openxmlformats.org/drawingml/2006/main" noChangeAspect="1"/>
             </wp:cNvGraphicFramePr>
@@ -1427,7 +1502,7 @@
               <a:graphicData uri="http://schemas.openxmlformats.org/drawingml/2006/picture">
                 <pic:pic xmlns:pic="http://schemas.openxmlformats.org/drawingml/2006/picture">
                   <pic:nvPicPr>
-                    <pic:cNvPr id="1777766022" name="Picture 1" descr="A screenshot of a chat&#10;&#10;AI-generated content may be incorrect."/>
+                    <pic:cNvPr id="1562815009" name=""/>
                     <pic:cNvPicPr/>
                   </pic:nvPicPr>
                   <pic:blipFill>
@@ -1439,7 +1514,7 @@
                   <pic:spPr>
                     <a:xfrm>
                       <a:off x="0" y="0"/>
-                      <a:ext cx="6490008" cy="4180369"/>
+                      <a:ext cx="6642336" cy="3694444"/>
                     </a:xfrm>
                     <a:prstGeom prst="rect">
                       <a:avLst/>
@@ -1455,24 +1530,27 @@
     <w:p>
       <w:pPr>
         <w:pStyle w:val="ListParagraph"/>
-        <w:ind w:left="0"/>
-      </w:pPr>
-    </w:p>
-    <w:p>
-      <w:pPr>
-        <w:pStyle w:val="ListParagraph"/>
-        <w:ind w:left="0"/>
-      </w:pPr>
+        <w:numPr>
+          <w:ilvl w:val="1"/>
+          <w:numId w:val="3"/>
+        </w:numPr>
+        <w:ind w:left="1530"/>
+      </w:pPr>
+      <w:r>
+        <w:t>Sample screenshots</w:t>
+      </w:r>
+    </w:p>
+    <w:p>
       <w:r>
         <w:rPr>
           <w:noProof/>
         </w:rPr>
         <w:lastRenderedPageBreak/>
         <w:drawing>
-          <wp:inline distT="0" distB="0" distL="0" distR="0" wp14:anchorId="5562A819" wp14:editId="6901A64E">
-            <wp:extent cx="6370320" cy="3924961"/>
+          <wp:inline distT="0" distB="0" distL="0" distR="0" wp14:anchorId="7861ADF8" wp14:editId="2D634E5C">
+            <wp:extent cx="5943600" cy="5145405"/>
             <wp:effectExtent l="0" t="0" r="0" b="0"/>
-            <wp:docPr id="103311865" name="Picture 1" descr="A screenshot of a chat&#10;&#10;AI-generated content may be incorrect."/>
+            <wp:docPr id="516436212" name="Picture 1"/>
             <wp:cNvGraphicFramePr>
               <a:graphicFrameLocks xmlns:a="http://schemas.openxmlformats.org/drawingml/2006/main" noChangeAspect="1"/>
             </wp:cNvGraphicFramePr>
@@ -1480,7 +1558,7 @@
               <a:graphicData uri="http://schemas.openxmlformats.org/drawingml/2006/picture">
                 <pic:pic xmlns:pic="http://schemas.openxmlformats.org/drawingml/2006/picture">
                   <pic:nvPicPr>
-                    <pic:cNvPr id="103311865" name="Picture 1" descr="A screenshot of a chat&#10;&#10;AI-generated content may be incorrect."/>
+                    <pic:cNvPr id="516436212" name=""/>
                     <pic:cNvPicPr/>
                   </pic:nvPicPr>
                   <pic:blipFill>
@@ -1492,7 +1570,51 @@
                   <pic:spPr>
                     <a:xfrm>
                       <a:off x="0" y="0"/>
-                      <a:ext cx="6377051" cy="3929108"/>
+                      <a:ext cx="5943600" cy="5145405"/>
+                    </a:xfrm>
+                    <a:prstGeom prst="rect">
+                      <a:avLst/>
+                    </a:prstGeom>
+                  </pic:spPr>
+                </pic:pic>
+              </a:graphicData>
+            </a:graphic>
+          </wp:inline>
+        </w:drawing>
+      </w:r>
+    </w:p>
+    <w:p/>
+    <w:p>
+      <w:r>
+        <w:rPr>
+          <w:noProof/>
+        </w:rPr>
+        <w:lastRenderedPageBreak/>
+        <w:drawing>
+          <wp:inline distT="0" distB="0" distL="0" distR="0" wp14:anchorId="24A25D4D" wp14:editId="39BAEDD5">
+            <wp:extent cx="5943600" cy="4540885"/>
+            <wp:effectExtent l="0" t="0" r="0" b="0"/>
+            <wp:docPr id="216509313" name="Picture 1"/>
+            <wp:cNvGraphicFramePr>
+              <a:graphicFrameLocks xmlns:a="http://schemas.openxmlformats.org/drawingml/2006/main" noChangeAspect="1"/>
+            </wp:cNvGraphicFramePr>
+            <a:graphic xmlns:a="http://schemas.openxmlformats.org/drawingml/2006/main">
+              <a:graphicData uri="http://schemas.openxmlformats.org/drawingml/2006/picture">
+                <pic:pic xmlns:pic="http://schemas.openxmlformats.org/drawingml/2006/picture">
+                  <pic:nvPicPr>
+                    <pic:cNvPr id="216509313" name=""/>
+                    <pic:cNvPicPr/>
+                  </pic:nvPicPr>
+                  <pic:blipFill>
+                    <a:blip r:embed="rId11"/>
+                    <a:stretch>
+                      <a:fillRect/>
+                    </a:stretch>
+                  </pic:blipFill>
+                  <pic:spPr>
+                    <a:xfrm>
+                      <a:off x="0" y="0"/>
+                      <a:ext cx="5943600" cy="4540885"/>
                     </a:xfrm>
                     <a:prstGeom prst="rect">
                       <a:avLst/>
@@ -1566,7 +1688,7 @@
                     <pic:cNvPicPr/>
                   </pic:nvPicPr>
                   <pic:blipFill>
-                    <a:blip r:embed="rId11"/>
+                    <a:blip r:embed="rId12"/>
                     <a:stretch>
                       <a:fillRect/>
                     </a:stretch>
@@ -1624,6 +1746,7 @@
       <w:r>
         <w:t xml:space="preserve">In this case, it refers user to the </w:t>
       </w:r>
+      <w:proofErr w:type="spellStart"/>
       <w:r>
         <w:rPr>
           <w:b/>
@@ -1638,6 +1761,7 @@
         </w:rPr>
         <w:t>’s</w:t>
       </w:r>
+      <w:proofErr w:type="spellEnd"/>
       <w:r>
         <w:t xml:space="preserve"> support phone number.</w:t>
       </w:r>
@@ -1672,7 +1796,7 @@
                     <pic:cNvPicPr/>
                   </pic:nvPicPr>
                   <pic:blipFill>
-                    <a:blip r:embed="rId12"/>
+                    <a:blip r:embed="rId13"/>
                     <a:stretch>
                       <a:fillRect/>
                     </a:stretch>
@@ -1744,7 +1868,7 @@
                     <pic:cNvPicPr/>
                   </pic:nvPicPr>
                   <pic:blipFill>
-                    <a:blip r:embed="rId13"/>
+                    <a:blip r:embed="rId14"/>
                     <a:stretch>
                       <a:fillRect/>
                     </a:stretch>
@@ -1816,7 +1940,7 @@
                     <pic:cNvPicPr/>
                   </pic:nvPicPr>
                   <pic:blipFill>
-                    <a:blip r:embed="rId14"/>
+                    <a:blip r:embed="rId15"/>
                     <a:stretch>
                       <a:fillRect/>
                     </a:stretch>
@@ -1888,7 +2012,7 @@
                     <pic:cNvPicPr/>
                   </pic:nvPicPr>
                   <pic:blipFill>
-                    <a:blip r:embed="rId15"/>
+                    <a:blip r:embed="rId16"/>
                     <a:stretch>
                       <a:fillRect/>
                     </a:stretch>
@@ -1966,7 +2090,7 @@
                     <pic:cNvPicPr/>
                   </pic:nvPicPr>
                   <pic:blipFill>
-                    <a:blip r:embed="rId16"/>
+                    <a:blip r:embed="rId17"/>
                     <a:stretch>
                       <a:fillRect/>
                     </a:stretch>
@@ -2276,7 +2400,7 @@
                     <pic:cNvPicPr/>
                   </pic:nvPicPr>
                   <pic:blipFill>
-                    <a:blip r:embed="rId17"/>
+                    <a:blip r:embed="rId18"/>
                     <a:stretch>
                       <a:fillRect/>
                     </a:stretch>
@@ -2332,8 +2456,13 @@
         <w:ind w:left="810"/>
       </w:pPr>
       <w:r>
-        <w:t>Using LangSmith</w:t>
-      </w:r>
+        <w:t xml:space="preserve">Using </w:t>
+      </w:r>
+      <w:proofErr w:type="spellStart"/>
+      <w:r>
+        <w:t>LangSmith</w:t>
+      </w:r>
+      <w:proofErr w:type="spellEnd"/>
     </w:p>
     <w:p>
       <w:pPr>
@@ -2356,9 +2485,17 @@
         <w:t xml:space="preserve"> will be recorded </w:t>
       </w:r>
       <w:r>
-        <w:t xml:space="preserve">on LangSmith website </w:t>
-      </w:r>
-      <w:hyperlink r:id="rId18" w:history="1">
+        <w:t xml:space="preserve">on </w:t>
+      </w:r>
+      <w:proofErr w:type="spellStart"/>
+      <w:r>
+        <w:t>LangSmith</w:t>
+      </w:r>
+      <w:proofErr w:type="spellEnd"/>
+      <w:r>
+        <w:t xml:space="preserve"> website </w:t>
+      </w:r>
+      <w:hyperlink r:id="rId19" w:history="1">
         <w:r>
           <w:rPr>
             <w:rStyle w:val="Hyperlink"/>
@@ -2370,7 +2507,15 @@
         <w:t xml:space="preserve"> </w:t>
       </w:r>
       <w:r>
-        <w:t xml:space="preserve"> with detail information like sessionid, date time, the flow of conversation, which tool has been called with which input parameters</w:t>
+        <w:t xml:space="preserve"> with detail information like </w:t>
+      </w:r>
+      <w:proofErr w:type="spellStart"/>
+      <w:r>
+        <w:t>sessionid</w:t>
+      </w:r>
+      <w:proofErr w:type="spellEnd"/>
+      <w:r>
+        <w:t>, date time, the flow of conversation, which tool has been called with which input parameters</w:t>
       </w:r>
       <w:r>
         <w:t>, the trace to LLM calls,..</w:t>
@@ -2401,7 +2546,7 @@
                     <pic:cNvPicPr/>
                   </pic:nvPicPr>
                   <pic:blipFill>
-                    <a:blip r:embed="rId19"/>
+                    <a:blip r:embed="rId20"/>
                     <a:stretch>
                       <a:fillRect/>
                     </a:stretch>
@@ -2915,12 +3060,21 @@
       <w:r>
         <w:t xml:space="preserve">Base model: </w:t>
       </w:r>
+      <w:proofErr w:type="spellStart"/>
       <w:r>
         <w:rPr>
           <w:b/>
           <w:bCs/>
         </w:rPr>
-        <w:t>distilbert-base-uncased</w:t>
+        <w:t>distilbert</w:t>
+      </w:r>
+      <w:proofErr w:type="spellEnd"/>
+      <w:r>
+        <w:rPr>
+          <w:b/>
+          <w:bCs/>
+        </w:rPr>
+        <w:t>-base-uncased</w:t>
       </w:r>
     </w:p>
     <w:p>
@@ -2933,7 +3087,15 @@
         <w:ind w:left="810"/>
       </w:pPr>
       <w:r>
-        <w:t>Apply LoRA technique to reduce number of parameters to be trained</w:t>
+        <w:t xml:space="preserve">Apply </w:t>
+      </w:r>
+      <w:proofErr w:type="spellStart"/>
+      <w:r>
+        <w:t>LoRA</w:t>
+      </w:r>
+      <w:proofErr w:type="spellEnd"/>
+      <w:r>
+        <w:t xml:space="preserve"> technique to reduce number of parameters to be trained</w:t>
       </w:r>
     </w:p>
     <w:p>
@@ -2946,7 +3108,15 @@
         <w:ind w:left="810"/>
       </w:pPr>
       <w:r>
-        <w:t>Use Google Colab to train the banking-intent dataset</w:t>
+        <w:t xml:space="preserve">Use Google </w:t>
+      </w:r>
+      <w:proofErr w:type="spellStart"/>
+      <w:r>
+        <w:t>Colab</w:t>
+      </w:r>
+      <w:proofErr w:type="spellEnd"/>
+      <w:r>
+        <w:t xml:space="preserve"> to train the banking-intent dataset</w:t>
       </w:r>
       <w:r>
         <w:t xml:space="preserve"> using GPU</w:t>
@@ -2970,8 +3140,13 @@
         <w:t xml:space="preserve"> (</w:t>
       </w:r>
       <w:r>
-        <w:t>models/intent_adapter</w:t>
-      </w:r>
+        <w:t>models/</w:t>
+      </w:r>
+      <w:proofErr w:type="spellStart"/>
+      <w:r>
+        <w:t>intent_adapter</w:t>
+      </w:r>
+      <w:proofErr w:type="spellEnd"/>
       <w:r>
         <w:t>)</w:t>
       </w:r>
@@ -3015,7 +3190,7 @@
                     <pic:cNvPicPr/>
                   </pic:nvPicPr>
                   <pic:blipFill>
-                    <a:blip r:embed="rId20"/>
+                    <a:blip r:embed="rId21"/>
                     <a:stretch>
                       <a:fillRect/>
                     </a:stretch>
@@ -3045,8 +3220,21 @@
         </w:numPr>
       </w:pPr>
       <w:r>
-        <w:t>Training loss is converging and gradually reaches to zero</w:t>
-      </w:r>
+        <w:t xml:space="preserve">Training loss is converging and gradually </w:t>
+      </w:r>
+      <w:proofErr w:type="gramStart"/>
+      <w:r>
+        <w:t>reaches to</w:t>
+      </w:r>
+      <w:proofErr w:type="gramEnd"/>
+      <w:r>
+        <w:t xml:space="preserve"> </w:t>
+      </w:r>
+      <w:proofErr w:type="gramStart"/>
+      <w:r>
+        <w:t>zero</w:t>
+      </w:r>
+      <w:proofErr w:type="gramEnd"/>
       <w:r>
         <w:t xml:space="preserve"> indicating the low rank matrices help pretrained model learn the training data well</w:t>
       </w:r>
@@ -3060,7 +3248,15 @@
         </w:numPr>
       </w:pPr>
       <w:r>
-        <w:t>Accuracy rises from 81.6% to 90.7% which is high and stable</w:t>
+        <w:t>Accuracy rises from 81.6% to 90.7%</w:t>
+      </w:r>
+      <w:proofErr w:type="gramStart"/>
+      <w:r>
+        <w:t xml:space="preserve"> which</w:t>
+      </w:r>
+      <w:proofErr w:type="gramEnd"/>
+      <w:r>
+        <w:t xml:space="preserve"> is high and stable</w:t>
       </w:r>
     </w:p>
     <w:p>
@@ -3072,7 +3268,23 @@
         </w:numPr>
       </w:pPr>
       <w:r>
-        <w:t>After epoch 3, training loss continues to drop sharply while validation loss stop improving and oscillating. Best checkpoint is likely around epoch 6 or 7</w:t>
+        <w:t xml:space="preserve">After epoch 3, training loss continues to drop sharply while validation loss </w:t>
+      </w:r>
+      <w:proofErr w:type="gramStart"/>
+      <w:r>
+        <w:t>stop</w:t>
+      </w:r>
+      <w:proofErr w:type="gramEnd"/>
+      <w:r>
+        <w:t xml:space="preserve"> improving and oscillating. Best checkpoint is likely around </w:t>
+      </w:r>
+      <w:proofErr w:type="gramStart"/>
+      <w:r>
+        <w:t>epoch</w:t>
+      </w:r>
+      <w:proofErr w:type="gramEnd"/>
+      <w:r>
+        <w:t xml:space="preserve"> 6 or 7</w:t>
       </w:r>
       <w:r>
         <w:t>.</w:t>
@@ -3122,7 +3334,23 @@
         <w:ind w:left="810"/>
       </w:pPr>
       <w:r>
-        <w:t>RAG evaluation’s result:</w:t>
+        <w:t xml:space="preserve">RAG </w:t>
+      </w:r>
+      <w:proofErr w:type="gramStart"/>
+      <w:r>
+        <w:t>evaluation’s</w:t>
+      </w:r>
+      <w:proofErr w:type="gramEnd"/>
+      <w:r>
+        <w:t xml:space="preserve"> </w:t>
+      </w:r>
+      <w:proofErr w:type="gramStart"/>
+      <w:r>
+        <w:t>result</w:t>
+      </w:r>
+      <w:proofErr w:type="gramEnd"/>
+      <w:r>
+        <w:t>:</w:t>
       </w:r>
     </w:p>
     <w:p>
@@ -3131,7 +3359,36 @@
         <w:ind w:left="810"/>
       </w:pPr>
       <w:r>
-        <w:t>'context_precision': 1.0000, 'context_recall': 0.7232, 'faithfulness': 0.8810, 'answer_relevancy': 0.7952</w:t>
+        <w:t>'</w:t>
+      </w:r>
+      <w:proofErr w:type="spellStart"/>
+      <w:proofErr w:type="gramStart"/>
+      <w:r>
+        <w:t>context</w:t>
+      </w:r>
+      <w:proofErr w:type="gramEnd"/>
+      <w:r>
+        <w:t>_precision</w:t>
+      </w:r>
+      <w:proofErr w:type="spellEnd"/>
+      <w:r>
+        <w:t>': 1.0000, '</w:t>
+      </w:r>
+      <w:proofErr w:type="spellStart"/>
+      <w:r>
+        <w:t>context_recall</w:t>
+      </w:r>
+      <w:proofErr w:type="spellEnd"/>
+      <w:r>
+        <w:t>': 0.7232, 'faithfulness': 0.8810, '</w:t>
+      </w:r>
+      <w:proofErr w:type="spellStart"/>
+      <w:r>
+        <w:t>answer_relevancy</w:t>
+      </w:r>
+      <w:proofErr w:type="spellEnd"/>
+      <w:r>
+        <w:t>': 0.7952</w:t>
       </w:r>
     </w:p>
     <w:p>
@@ -3188,7 +3445,23 @@
         <w:ind w:left="1440"/>
       </w:pPr>
       <w:r>
-        <w:t>We can consider to increase top retrieved k, chunk size, overlap size</w:t>
+        <w:t xml:space="preserve">We can consider </w:t>
+      </w:r>
+      <w:proofErr w:type="gramStart"/>
+      <w:r>
+        <w:t>to increase</w:t>
+      </w:r>
+      <w:proofErr w:type="gramEnd"/>
+      <w:r>
+        <w:t xml:space="preserve"> top retrieved k, chunk size</w:t>
+      </w:r>
+      <w:proofErr w:type="gramStart"/>
+      <w:r>
+        <w:t>, overlap</w:t>
+      </w:r>
+      <w:proofErr w:type="gramEnd"/>
+      <w:r>
+        <w:t xml:space="preserve"> size</w:t>
       </w:r>
     </w:p>
     <w:p>
@@ -3251,11 +3524,16 @@
         <w:t>, Ensemble Retrieval</w:t>
       </w:r>
       <w:r>
-        <w:t xml:space="preserve"> (run more than one retriever for the same question then combined into 1 list based on their rank)</w:t>
+        <w:t xml:space="preserve"> (run more than one retriever for the same question then combined into 1 list based on their rank</w:t>
+      </w:r>
+      <w:proofErr w:type="gramStart"/>
+      <w:r>
+        <w:t>)</w:t>
       </w:r>
       <w:r>
         <w:t>,..</w:t>
       </w:r>
+      <w:proofErr w:type="gramEnd"/>
     </w:p>
     <w:p>
       <w:pPr>
@@ -3325,7 +3603,23 @@
         <w:t>is</w:t>
       </w:r>
       <w:r>
-        <w:t xml:space="preserve"> written under *.py file to be published on a cloud. So we need to build an interface to interact with end user</w:t>
+        <w:t xml:space="preserve"> written under *.</w:t>
+      </w:r>
+      <w:proofErr w:type="spellStart"/>
+      <w:r>
+        <w:t>py</w:t>
+      </w:r>
+      <w:proofErr w:type="spellEnd"/>
+      <w:r>
+        <w:t xml:space="preserve"> file to be published on a cloud. </w:t>
+      </w:r>
+      <w:proofErr w:type="gramStart"/>
+      <w:r>
+        <w:t>So</w:t>
+      </w:r>
+      <w:proofErr w:type="gramEnd"/>
+      <w:r>
+        <w:t xml:space="preserve"> we need to build an interface to interact with end user</w:t>
       </w:r>
       <w:r>
         <w:t>s</w:t>
@@ -3381,9 +3675,11 @@
       <w:r>
         <w:t xml:space="preserve">LLM Model name: </w:t>
       </w:r>
+      <w:proofErr w:type="spellStart"/>
       <w:r>
         <w:t>AzureChatOpenAI</w:t>
       </w:r>
+      <w:proofErr w:type="spellEnd"/>
     </w:p>
     <w:p>
       <w:pPr>
@@ -3395,8 +3691,21 @@
         <w:ind w:left="810"/>
       </w:pPr>
       <w:r>
-        <w:t>Agentic framework: LangChain and LangGraph</w:t>
-      </w:r>
+        <w:t xml:space="preserve">Agentic framework: </w:t>
+      </w:r>
+      <w:proofErr w:type="spellStart"/>
+      <w:r>
+        <w:t>LangChain</w:t>
+      </w:r>
+      <w:proofErr w:type="spellEnd"/>
+      <w:r>
+        <w:t xml:space="preserve"> and </w:t>
+      </w:r>
+      <w:proofErr w:type="spellStart"/>
+      <w:r>
+        <w:t>LangGraph</w:t>
+      </w:r>
+      <w:proofErr w:type="spellEnd"/>
     </w:p>
     <w:p>
       <w:pPr>
@@ -3410,9 +3719,11 @@
       <w:r>
         <w:t xml:space="preserve">Embedding model: </w:t>
       </w:r>
+      <w:proofErr w:type="spellStart"/>
       <w:r>
         <w:t>MistralAIEmbeddings</w:t>
       </w:r>
+      <w:proofErr w:type="spellEnd"/>
     </w:p>
     <w:p>
       <w:pPr>
@@ -3483,9 +3794,19 @@
         </w:numPr>
         <w:ind w:left="810"/>
       </w:pPr>
-      <w:r>
-        <w:t>Back end framework: FastAPI</w:t>
-      </w:r>
+      <w:proofErr w:type="gramStart"/>
+      <w:r>
+        <w:t>Back end</w:t>
+      </w:r>
+      <w:proofErr w:type="gramEnd"/>
+      <w:r>
+        <w:t xml:space="preserve"> framework: </w:t>
+      </w:r>
+      <w:proofErr w:type="spellStart"/>
+      <w:r>
+        <w:t>FastAPI</w:t>
+      </w:r>
+      <w:proofErr w:type="spellEnd"/>
     </w:p>
     <w:p>
       <w:pPr>
@@ -3587,7 +3908,15 @@
         <w:ind w:left="810"/>
       </w:pPr>
       <w:r>
-        <w:t>Add more patterns when user says yes/no when confirming an update</w:t>
+        <w:t>Add more patterns when user says yes/</w:t>
+      </w:r>
+      <w:proofErr w:type="gramStart"/>
+      <w:r>
+        <w:t>no</w:t>
+      </w:r>
+      <w:proofErr w:type="gramEnd"/>
+      <w:r>
+        <w:t xml:space="preserve"> when confirming an update</w:t>
       </w:r>
     </w:p>
     <w:p>
@@ -3739,7 +4068,7 @@
       <w:r>
         <w:t xml:space="preserve">: </w:t>
       </w:r>
-      <w:hyperlink r:id="rId21" w:history="1">
+      <w:hyperlink r:id="rId22" w:history="1">
         <w:r>
           <w:rPr>
             <w:rStyle w:val="Hyperlink"/>

</xml_diff>